<commit_message>
updated tables with 1 decimal
</commit_message>
<xml_diff>
--- a/3_Manuscript_Figures/tables/table3.docx
+++ b/3_Manuscript_Figures/tables/table3.docx
@@ -16,14 +16,14 @@
         <w:tblLook w:val="0420" w:firstRow="1" w:lastRow="0" w:firstColumn="0" w:lastColumn="0" w:noHBand="0" w:noVBand="1"/>
       </w:tblPr>
       <w:tblGrid>
-        <w:gridCol w:w="1108"/>
-        <w:gridCol w:w="692"/>
-        <w:gridCol w:w="1298"/>
-        <w:gridCol w:w="1298"/>
-        <w:gridCol w:w="1033"/>
-        <w:gridCol w:w="1033"/>
-        <w:gridCol w:w="1033"/>
-        <w:gridCol w:w="1620"/>
+        <w:gridCol w:w="1530"/>
+        <w:gridCol w:w="720"/>
+        <w:gridCol w:w="1260"/>
+        <w:gridCol w:w="1170"/>
+        <w:gridCol w:w="990"/>
+        <w:gridCol w:w="990"/>
+        <w:gridCol w:w="990"/>
+        <w:gridCol w:w="1465"/>
       </w:tblGrid>
       <w:tr>
         <w:trPr>
@@ -32,7 +32,7 @@
         </w:trPr>
         <w:tc>
           <w:tcPr>
-            <w:tcW w:w="1108" w:type="dxa"/>
+            <w:tcW w:w="1530" w:type="dxa"/>
           </w:tcPr>
           <w:p>
             <w:pPr>
@@ -56,7 +56,7 @@
         </w:tc>
         <w:tc>
           <w:tcPr>
-            <w:tcW w:w="692" w:type="dxa"/>
+            <w:tcW w:w="720" w:type="dxa"/>
           </w:tcPr>
           <w:p>
             <w:pPr>
@@ -80,7 +80,7 @@
         </w:tc>
         <w:tc>
           <w:tcPr>
-            <w:tcW w:w="1298" w:type="dxa"/>
+            <w:tcW w:w="1260" w:type="dxa"/>
           </w:tcPr>
           <w:p>
             <w:pPr>
@@ -107,8 +107,32 @@
                 <w:sz w:val="16"/>
                 <w:szCs w:val="16"/>
               </w:rPr>
-              <w:t>BMDE-noWTT-CPM-RF-S</w:t>
-            </w:r>
+              <w:t>BMDE-noWTT-CPM-RF-S5</w:t>
+            </w:r>
+          </w:p>
+        </w:tc>
+        <w:tc>
+          <w:tcPr>
+            <w:tcW w:w="1170" w:type="dxa"/>
+          </w:tcPr>
+          <w:p>
+            <w:pPr>
+              <w:pBdr>
+                <w:top w:val="none" w:sz="0" w:space="0" w:color="000000"/>
+                <w:left w:val="none" w:sz="0" w:space="0" w:color="000000"/>
+                <w:bottom w:val="none" w:sz="0" w:space="0" w:color="000000"/>
+                <w:right w:val="none" w:sz="0" w:space="0" w:color="000000"/>
+              </w:pBdr>
+              <w:spacing w:before="100" w:after="100"/>
+              <w:ind w:left="100" w:right="100"/>
+              <w:rPr>
+                <w:rFonts w:ascii="Aptos" w:eastAsia="Helvetica" w:hAnsi="Aptos" w:cs="Helvetica"/>
+                <w:color w:val="000000"/>
+                <w:sz w:val="16"/>
+                <w:szCs w:val="16"/>
+                <w:lang w:val="nl-NL"/>
+              </w:rPr>
+            </w:pPr>
             <w:r>
               <w:rPr>
                 <w:rFonts w:ascii="Aptos" w:eastAsia="Helvetica" w:hAnsi="Aptos" w:cs="Helvetica"/>
@@ -116,33 +140,10 @@
                 <w:color w:val="000000"/>
                 <w:sz w:val="16"/>
                 <w:szCs w:val="16"/>
-              </w:rPr>
-              <w:t>5</w:t>
-            </w:r>
-          </w:p>
-        </w:tc>
-        <w:tc>
-          <w:tcPr>
-            <w:tcW w:w="1298" w:type="dxa"/>
-          </w:tcPr>
-          <w:p>
-            <w:pPr>
-              <w:pBdr>
-                <w:top w:val="none" w:sz="0" w:space="0" w:color="000000"/>
-                <w:left w:val="none" w:sz="0" w:space="0" w:color="000000"/>
-                <w:bottom w:val="none" w:sz="0" w:space="0" w:color="000000"/>
-                <w:right w:val="none" w:sz="0" w:space="0" w:color="000000"/>
-              </w:pBdr>
-              <w:spacing w:before="100" w:after="100"/>
-              <w:ind w:left="100" w:right="100"/>
-              <w:rPr>
-                <w:rFonts w:ascii="Aptos" w:eastAsia="Helvetica" w:hAnsi="Aptos" w:cs="Helvetica"/>
-                <w:color w:val="000000"/>
-                <w:sz w:val="16"/>
-                <w:szCs w:val="16"/>
                 <w:lang w:val="nl-NL"/>
               </w:rPr>
-            </w:pPr>
+              <w:t>BMDE-WTT-CPM-RF-S</w:t>
+            </w:r>
             <w:r>
               <w:rPr>
                 <w:rFonts w:ascii="Aptos" w:eastAsia="Helvetica" w:hAnsi="Aptos" w:cs="Helvetica"/>
@@ -152,8 +153,32 @@
                 <w:szCs w:val="16"/>
                 <w:lang w:val="nl-NL"/>
               </w:rPr>
-              <w:t>BMDE-WTT-CPM-RF-S</w:t>
-            </w:r>
+              <w:t>0</w:t>
+            </w:r>
+          </w:p>
+        </w:tc>
+        <w:tc>
+          <w:tcPr>
+            <w:tcW w:w="990" w:type="dxa"/>
+          </w:tcPr>
+          <w:p>
+            <w:pPr>
+              <w:pBdr>
+                <w:top w:val="none" w:sz="0" w:space="0" w:color="000000"/>
+                <w:left w:val="none" w:sz="0" w:space="0" w:color="000000"/>
+                <w:bottom w:val="none" w:sz="0" w:space="0" w:color="000000"/>
+                <w:right w:val="none" w:sz="0" w:space="0" w:color="000000"/>
+              </w:pBdr>
+              <w:spacing w:before="100" w:after="100"/>
+              <w:ind w:left="100" w:right="100"/>
+              <w:rPr>
+                <w:rFonts w:ascii="Aptos" w:eastAsia="Helvetica" w:hAnsi="Aptos" w:cs="Helvetica"/>
+                <w:color w:val="000000"/>
+                <w:sz w:val="16"/>
+                <w:szCs w:val="16"/>
+                <w:lang w:val="it-IT"/>
+              </w:rPr>
+            </w:pPr>
             <w:r>
               <w:rPr>
                 <w:rFonts w:ascii="Aptos" w:eastAsia="Helvetica" w:hAnsi="Aptos" w:cs="Helvetica"/>
@@ -161,34 +186,26 @@
                 <w:color w:val="000000"/>
                 <w:sz w:val="16"/>
                 <w:szCs w:val="16"/>
-                <w:lang w:val="nl-NL"/>
-              </w:rPr>
-              <w:t>0</w:t>
-            </w:r>
-          </w:p>
-        </w:tc>
-        <w:tc>
-          <w:tcPr>
-            <w:tcW w:w="1033" w:type="dxa"/>
-          </w:tcPr>
-          <w:p>
-            <w:pPr>
-              <w:pBdr>
-                <w:top w:val="none" w:sz="0" w:space="0" w:color="000000"/>
-                <w:left w:val="none" w:sz="0" w:space="0" w:color="000000"/>
-                <w:bottom w:val="none" w:sz="0" w:space="0" w:color="000000"/>
-                <w:right w:val="none" w:sz="0" w:space="0" w:color="000000"/>
-              </w:pBdr>
-              <w:spacing w:before="100" w:after="100"/>
-              <w:ind w:left="100" w:right="100"/>
-              <w:rPr>
-                <w:rFonts w:ascii="Aptos" w:eastAsia="Helvetica" w:hAnsi="Aptos" w:cs="Helvetica"/>
-                <w:color w:val="000000"/>
-                <w:sz w:val="16"/>
-                <w:szCs w:val="16"/>
-              </w:rPr>
-            </w:pPr>
-            <w:r>
+                <w:lang w:val="it-IT"/>
+              </w:rPr>
+              <w:t>DRO-Quad-UQ-RF-S0</w:t>
+            </w:r>
+          </w:p>
+        </w:tc>
+        <w:tc>
+          <w:tcPr>
+            <w:tcW w:w="990" w:type="dxa"/>
+          </w:tcPr>
+          <w:p>
+            <w:pPr>
+              <w:pBdr>
+                <w:top w:val="none" w:sz="0" w:space="0" w:color="000000"/>
+                <w:left w:val="none" w:sz="0" w:space="0" w:color="000000"/>
+                <w:bottom w:val="none" w:sz="0" w:space="0" w:color="000000"/>
+                <w:right w:val="none" w:sz="0" w:space="0" w:color="000000"/>
+              </w:pBdr>
+              <w:spacing w:before="100" w:after="100"/>
+              <w:ind w:left="100" w:right="100"/>
               <w:rPr>
                 <w:rFonts w:ascii="Aptos" w:eastAsia="Helvetica" w:hAnsi="Aptos" w:cs="Helvetica"/>
                 <w:bCs w:val="0"/>
@@ -196,24 +213,8 @@
                 <w:sz w:val="16"/>
                 <w:szCs w:val="16"/>
               </w:rPr>
-              <w:t>DRO-Quad-UQ-RF-S0</w:t>
-            </w:r>
-          </w:p>
-        </w:tc>
-        <w:tc>
-          <w:tcPr>
-            <w:tcW w:w="1033" w:type="dxa"/>
-          </w:tcPr>
-          <w:p>
-            <w:pPr>
-              <w:pBdr>
-                <w:top w:val="none" w:sz="0" w:space="0" w:color="000000"/>
-                <w:left w:val="none" w:sz="0" w:space="0" w:color="000000"/>
-                <w:bottom w:val="none" w:sz="0" w:space="0" w:color="000000"/>
-                <w:right w:val="none" w:sz="0" w:space="0" w:color="000000"/>
-              </w:pBdr>
-              <w:spacing w:before="100" w:after="100"/>
-              <w:ind w:left="100" w:right="100"/>
+            </w:pPr>
+            <w:r>
               <w:rPr>
                 <w:rFonts w:ascii="Aptos" w:eastAsia="Helvetica" w:hAnsi="Aptos" w:cs="Helvetica"/>
                 <w:bCs w:val="0"/>
@@ -221,8 +222,24 @@
                 <w:sz w:val="16"/>
                 <w:szCs w:val="16"/>
               </w:rPr>
-            </w:pPr>
-            <w:r>
+              <w:t>DRO-Quad-VST-C10-S0</w:t>
+            </w:r>
+          </w:p>
+        </w:tc>
+        <w:tc>
+          <w:tcPr>
+            <w:tcW w:w="990" w:type="dxa"/>
+          </w:tcPr>
+          <w:p>
+            <w:pPr>
+              <w:pBdr>
+                <w:top w:val="none" w:sz="0" w:space="0" w:color="000000"/>
+                <w:left w:val="none" w:sz="0" w:space="0" w:color="000000"/>
+                <w:bottom w:val="none" w:sz="0" w:space="0" w:color="000000"/>
+                <w:right w:val="none" w:sz="0" w:space="0" w:color="000000"/>
+              </w:pBdr>
+              <w:spacing w:before="100" w:after="100"/>
+              <w:ind w:left="100" w:right="100"/>
               <w:rPr>
                 <w:rFonts w:ascii="Aptos" w:eastAsia="Helvetica" w:hAnsi="Aptos" w:cs="Helvetica"/>
                 <w:bCs w:val="0"/>
@@ -230,24 +247,8 @@
                 <w:sz w:val="16"/>
                 <w:szCs w:val="16"/>
               </w:rPr>
-              <w:t>DRO-Quad-VST-C10-S0</w:t>
-            </w:r>
-          </w:p>
-        </w:tc>
-        <w:tc>
-          <w:tcPr>
-            <w:tcW w:w="1033" w:type="dxa"/>
-          </w:tcPr>
-          <w:p>
-            <w:pPr>
-              <w:pBdr>
-                <w:top w:val="none" w:sz="0" w:space="0" w:color="000000"/>
-                <w:left w:val="none" w:sz="0" w:space="0" w:color="000000"/>
-                <w:bottom w:val="none" w:sz="0" w:space="0" w:color="000000"/>
-                <w:right w:val="none" w:sz="0" w:space="0" w:color="000000"/>
-              </w:pBdr>
-              <w:spacing w:before="100" w:after="100"/>
-              <w:ind w:left="100" w:right="100"/>
+            </w:pPr>
+            <w:r>
               <w:rPr>
                 <w:rFonts w:ascii="Aptos" w:eastAsia="Helvetica" w:hAnsi="Aptos" w:cs="Helvetica"/>
                 <w:bCs w:val="0"/>
@@ -255,22 +256,13 @@
                 <w:sz w:val="16"/>
                 <w:szCs w:val="16"/>
               </w:rPr>
-            </w:pPr>
-            <w:r>
-              <w:rPr>
-                <w:rFonts w:ascii="Aptos" w:eastAsia="Helvetica" w:hAnsi="Aptos" w:cs="Helvetica"/>
-                <w:bCs w:val="0"/>
-                <w:color w:val="000000"/>
-                <w:sz w:val="16"/>
-                <w:szCs w:val="16"/>
-              </w:rPr>
               <w:t>DRO-Quad-VST-RF-S0</w:t>
             </w:r>
           </w:p>
         </w:tc>
         <w:tc>
           <w:tcPr>
-            <w:tcW w:w="1620" w:type="dxa"/>
+            <w:tcW w:w="1465" w:type="dxa"/>
           </w:tcPr>
           <w:p>
             <w:pPr>
@@ -310,7 +302,7 @@
         </w:trPr>
         <w:tc>
           <w:tcPr>
-            <w:tcW w:w="1108" w:type="dxa"/>
+            <w:tcW w:w="1530" w:type="dxa"/>
           </w:tcPr>
           <w:p>
             <w:pPr>
@@ -338,36 +330,56 @@
                 <w:sz w:val="16"/>
                 <w:szCs w:val="16"/>
               </w:rPr>
-              <w:t>Criteria to identify dose responsive genes</w:t>
-            </w:r>
-          </w:p>
-        </w:tc>
-        <w:tc>
-          <w:tcPr>
-            <w:tcW w:w="692" w:type="dxa"/>
-          </w:tcPr>
-          <w:p>
-            <w:pPr>
-              <w:pBdr>
-                <w:top w:val="none" w:sz="0" w:space="0" w:color="000000"/>
-                <w:left w:val="none" w:sz="0" w:space="0" w:color="000000"/>
-                <w:bottom w:val="none" w:sz="0" w:space="0" w:color="000000"/>
-                <w:right w:val="none" w:sz="0" w:space="0" w:color="000000"/>
-              </w:pBdr>
-              <w:spacing w:before="100" w:after="100"/>
-              <w:ind w:left="100" w:right="100"/>
-              <w:rPr>
-                <w:rFonts w:ascii="Aptos" w:eastAsia="Helvetica" w:hAnsi="Aptos" w:cs="Helvetica"/>
-                <w:color w:val="000000"/>
-                <w:sz w:val="16"/>
-                <w:szCs w:val="16"/>
-              </w:rPr>
-            </w:pPr>
-          </w:p>
-        </w:tc>
-        <w:tc>
-          <w:tcPr>
-            <w:tcW w:w="1298" w:type="dxa"/>
+              <w:t xml:space="preserve">Criteria to identify </w:t>
+            </w:r>
+            <w:r>
+              <w:rPr>
+                <w:rFonts w:ascii="Aptos" w:eastAsia="Helvetica" w:hAnsi="Aptos" w:cs="Helvetica"/>
+                <w:b/>
+                <w:color w:val="000000"/>
+                <w:sz w:val="16"/>
+                <w:szCs w:val="16"/>
+              </w:rPr>
+              <w:t>concentration</w:t>
+            </w:r>
+            <w:r>
+              <w:rPr>
+                <w:rFonts w:ascii="Aptos" w:eastAsia="Helvetica" w:hAnsi="Aptos" w:cs="Helvetica"/>
+                <w:b/>
+                <w:color w:val="000000"/>
+                <w:sz w:val="16"/>
+                <w:szCs w:val="16"/>
+              </w:rPr>
+              <w:t xml:space="preserve"> responsive genes</w:t>
+            </w:r>
+          </w:p>
+        </w:tc>
+        <w:tc>
+          <w:tcPr>
+            <w:tcW w:w="720" w:type="dxa"/>
+          </w:tcPr>
+          <w:p>
+            <w:pPr>
+              <w:pBdr>
+                <w:top w:val="none" w:sz="0" w:space="0" w:color="000000"/>
+                <w:left w:val="none" w:sz="0" w:space="0" w:color="000000"/>
+                <w:bottom w:val="none" w:sz="0" w:space="0" w:color="000000"/>
+                <w:right w:val="none" w:sz="0" w:space="0" w:color="000000"/>
+              </w:pBdr>
+              <w:spacing w:before="100" w:after="100"/>
+              <w:ind w:left="100" w:right="100"/>
+              <w:rPr>
+                <w:rFonts w:ascii="Aptos" w:eastAsia="Helvetica" w:hAnsi="Aptos" w:cs="Helvetica"/>
+                <w:color w:val="000000"/>
+                <w:sz w:val="16"/>
+                <w:szCs w:val="16"/>
+              </w:rPr>
+            </w:pPr>
+          </w:p>
+        </w:tc>
+        <w:tc>
+          <w:tcPr>
+            <w:tcW w:w="1260" w:type="dxa"/>
           </w:tcPr>
           <w:p>
             <w:pPr>
@@ -399,7 +411,7 @@
         </w:tc>
         <w:tc>
           <w:tcPr>
-            <w:tcW w:w="1298" w:type="dxa"/>
+            <w:tcW w:w="1170" w:type="dxa"/>
           </w:tcPr>
           <w:p>
             <w:pPr>
@@ -431,7 +443,7 @@
         </w:tc>
         <w:tc>
           <w:tcPr>
-            <w:tcW w:w="1033" w:type="dxa"/>
+            <w:tcW w:w="990" w:type="dxa"/>
           </w:tcPr>
           <w:p>
             <w:pPr>
@@ -481,7 +493,7 @@
         </w:tc>
         <w:tc>
           <w:tcPr>
-            <w:tcW w:w="1033" w:type="dxa"/>
+            <w:tcW w:w="990" w:type="dxa"/>
           </w:tcPr>
           <w:p>
             <w:pPr>
@@ -531,7 +543,7 @@
         </w:tc>
         <w:tc>
           <w:tcPr>
-            <w:tcW w:w="1033" w:type="dxa"/>
+            <w:tcW w:w="990" w:type="dxa"/>
           </w:tcPr>
           <w:p>
             <w:pPr>
@@ -581,7 +593,7 @@
         </w:tc>
         <w:tc>
           <w:tcPr>
-            <w:tcW w:w="1620" w:type="dxa"/>
+            <w:tcW w:w="1465" w:type="dxa"/>
           </w:tcPr>
           <w:p>
             <w:pPr>
@@ -609,7 +621,7 @@
         </w:trPr>
         <w:tc>
           <w:tcPr>
-            <w:tcW w:w="1108" w:type="dxa"/>
+            <w:tcW w:w="1530" w:type="dxa"/>
             <w:vMerge w:val="restart"/>
           </w:tcPr>
           <w:p>
@@ -638,45 +650,73 @@
                 <w:sz w:val="16"/>
                 <w:szCs w:val="16"/>
               </w:rPr>
-              <w:t>Dose Responsive Genes (n)</w:t>
-            </w:r>
-          </w:p>
-        </w:tc>
-        <w:tc>
-          <w:tcPr>
-            <w:tcW w:w="692" w:type="dxa"/>
-          </w:tcPr>
-          <w:p>
-            <w:pPr>
-              <w:pBdr>
-                <w:top w:val="none" w:sz="0" w:space="0" w:color="000000"/>
-                <w:left w:val="none" w:sz="0" w:space="0" w:color="000000"/>
-                <w:bottom w:val="none" w:sz="0" w:space="0" w:color="000000"/>
-                <w:right w:val="none" w:sz="0" w:space="0" w:color="000000"/>
-              </w:pBdr>
-              <w:spacing w:before="100" w:after="100"/>
-              <w:ind w:left="100" w:right="100"/>
-              <w:rPr>
-                <w:rFonts w:ascii="Aptos" w:eastAsia="Helvetica" w:hAnsi="Aptos" w:cs="Helvetica"/>
-                <w:color w:val="000000"/>
-                <w:sz w:val="16"/>
-                <w:szCs w:val="16"/>
-              </w:rPr>
-            </w:pPr>
-            <w:r>
-              <w:rPr>
-                <w:rFonts w:ascii="Aptos" w:eastAsia="Helvetica" w:hAnsi="Aptos" w:cs="Helvetica"/>
-                <w:color w:val="000000"/>
-                <w:sz w:val="16"/>
-                <w:szCs w:val="16"/>
-              </w:rPr>
-              <w:t>4h</w:t>
-            </w:r>
-          </w:p>
-        </w:tc>
-        <w:tc>
-          <w:tcPr>
-            <w:tcW w:w="1298" w:type="dxa"/>
+              <w:t>Concentration</w:t>
+            </w:r>
+            <w:r>
+              <w:rPr>
+                <w:rFonts w:ascii="Aptos" w:eastAsia="Helvetica" w:hAnsi="Aptos" w:cs="Helvetica"/>
+                <w:b/>
+                <w:color w:val="000000"/>
+                <w:sz w:val="16"/>
+                <w:szCs w:val="16"/>
+              </w:rPr>
+              <w:t xml:space="preserve"> Responsive Genes (n)</w:t>
+            </w:r>
+          </w:p>
+        </w:tc>
+        <w:tc>
+          <w:tcPr>
+            <w:tcW w:w="720" w:type="dxa"/>
+          </w:tcPr>
+          <w:p>
+            <w:pPr>
+              <w:pBdr>
+                <w:top w:val="none" w:sz="0" w:space="0" w:color="000000"/>
+                <w:left w:val="none" w:sz="0" w:space="0" w:color="000000"/>
+                <w:bottom w:val="none" w:sz="0" w:space="0" w:color="000000"/>
+                <w:right w:val="none" w:sz="0" w:space="0" w:color="000000"/>
+              </w:pBdr>
+              <w:spacing w:before="100" w:after="100"/>
+              <w:ind w:left="100" w:right="100"/>
+              <w:rPr>
+                <w:rFonts w:ascii="Aptos" w:eastAsia="Helvetica" w:hAnsi="Aptos" w:cs="Helvetica"/>
+                <w:color w:val="000000"/>
+                <w:sz w:val="16"/>
+                <w:szCs w:val="16"/>
+              </w:rPr>
+            </w:pPr>
+            <w:r>
+              <w:rPr>
+                <w:rFonts w:ascii="Aptos" w:eastAsia="Helvetica" w:hAnsi="Aptos" w:cs="Helvetica"/>
+                <w:color w:val="000000"/>
+                <w:sz w:val="16"/>
+                <w:szCs w:val="16"/>
+              </w:rPr>
+              <w:t>4</w:t>
+            </w:r>
+            <w:r>
+              <w:rPr>
+                <w:rFonts w:ascii="Aptos" w:eastAsia="Helvetica" w:hAnsi="Aptos" w:cs="Helvetica"/>
+                <w:color w:val="000000"/>
+                <w:sz w:val="16"/>
+                <w:szCs w:val="16"/>
+              </w:rPr>
+              <w:t xml:space="preserve"> </w:t>
+            </w:r>
+            <w:r>
+              <w:rPr>
+                <w:rFonts w:ascii="Aptos" w:eastAsia="Helvetica" w:hAnsi="Aptos" w:cs="Helvetica"/>
+                <w:color w:val="000000"/>
+                <w:sz w:val="16"/>
+                <w:szCs w:val="16"/>
+              </w:rPr>
+              <w:t>h</w:t>
+            </w:r>
+          </w:p>
+        </w:tc>
+        <w:tc>
+          <w:tcPr>
+            <w:tcW w:w="1260" w:type="dxa"/>
             <w:vAlign w:val="center"/>
           </w:tcPr>
           <w:p>
@@ -709,7 +749,7 @@
         </w:tc>
         <w:tc>
           <w:tcPr>
-            <w:tcW w:w="1298" w:type="dxa"/>
+            <w:tcW w:w="1170" w:type="dxa"/>
             <w:vAlign w:val="center"/>
           </w:tcPr>
           <w:p>
@@ -742,7 +782,7 @@
         </w:tc>
         <w:tc>
           <w:tcPr>
-            <w:tcW w:w="1033" w:type="dxa"/>
+            <w:tcW w:w="990" w:type="dxa"/>
             <w:vAlign w:val="center"/>
           </w:tcPr>
           <w:p>
@@ -775,7 +815,7 @@
         </w:tc>
         <w:tc>
           <w:tcPr>
-            <w:tcW w:w="1033" w:type="dxa"/>
+            <w:tcW w:w="990" w:type="dxa"/>
             <w:vAlign w:val="center"/>
           </w:tcPr>
           <w:p>
@@ -808,7 +848,7 @@
         </w:tc>
         <w:tc>
           <w:tcPr>
-            <w:tcW w:w="1033" w:type="dxa"/>
+            <w:tcW w:w="990" w:type="dxa"/>
             <w:vAlign w:val="center"/>
           </w:tcPr>
           <w:p>
@@ -841,7 +881,7 @@
         </w:tc>
         <w:tc>
           <w:tcPr>
-            <w:tcW w:w="1620" w:type="dxa"/>
+            <w:tcW w:w="1465" w:type="dxa"/>
             <w:vAlign w:val="center"/>
           </w:tcPr>
           <w:p>
@@ -880,7 +920,7 @@
         </w:trPr>
         <w:tc>
           <w:tcPr>
-            <w:tcW w:w="1108" w:type="dxa"/>
+            <w:tcW w:w="1530" w:type="dxa"/>
             <w:vMerge/>
           </w:tcPr>
           <w:p>
@@ -905,39 +945,57 @@
         </w:tc>
         <w:tc>
           <w:tcPr>
-            <w:tcW w:w="692" w:type="dxa"/>
-          </w:tcPr>
-          <w:p>
-            <w:pPr>
-              <w:pBdr>
-                <w:top w:val="none" w:sz="0" w:space="0" w:color="000000"/>
-                <w:left w:val="none" w:sz="0" w:space="0" w:color="000000"/>
-                <w:bottom w:val="none" w:sz="0" w:space="0" w:color="000000"/>
-                <w:right w:val="none" w:sz="0" w:space="0" w:color="000000"/>
-              </w:pBdr>
-              <w:spacing w:before="100" w:after="100"/>
-              <w:ind w:left="100" w:right="100"/>
-              <w:rPr>
-                <w:rFonts w:ascii="Aptos" w:eastAsia="Helvetica" w:hAnsi="Aptos" w:cs="Helvetica"/>
-                <w:color w:val="000000"/>
-                <w:sz w:val="16"/>
-                <w:szCs w:val="16"/>
-              </w:rPr>
-            </w:pPr>
-            <w:r>
-              <w:rPr>
-                <w:rFonts w:ascii="Aptos" w:eastAsia="Helvetica" w:hAnsi="Aptos" w:cs="Helvetica"/>
-                <w:color w:val="000000"/>
-                <w:sz w:val="16"/>
-                <w:szCs w:val="16"/>
-              </w:rPr>
-              <w:t>8h</w:t>
-            </w:r>
-          </w:p>
-        </w:tc>
-        <w:tc>
-          <w:tcPr>
-            <w:tcW w:w="1298" w:type="dxa"/>
+            <w:tcW w:w="720" w:type="dxa"/>
+          </w:tcPr>
+          <w:p>
+            <w:pPr>
+              <w:pBdr>
+                <w:top w:val="none" w:sz="0" w:space="0" w:color="000000"/>
+                <w:left w:val="none" w:sz="0" w:space="0" w:color="000000"/>
+                <w:bottom w:val="none" w:sz="0" w:space="0" w:color="000000"/>
+                <w:right w:val="none" w:sz="0" w:space="0" w:color="000000"/>
+              </w:pBdr>
+              <w:spacing w:before="100" w:after="100"/>
+              <w:ind w:left="100" w:right="100"/>
+              <w:rPr>
+                <w:rFonts w:ascii="Aptos" w:eastAsia="Helvetica" w:hAnsi="Aptos" w:cs="Helvetica"/>
+                <w:color w:val="000000"/>
+                <w:sz w:val="16"/>
+                <w:szCs w:val="16"/>
+              </w:rPr>
+            </w:pPr>
+            <w:r>
+              <w:rPr>
+                <w:rFonts w:ascii="Aptos" w:eastAsia="Helvetica" w:hAnsi="Aptos" w:cs="Helvetica"/>
+                <w:color w:val="000000"/>
+                <w:sz w:val="16"/>
+                <w:szCs w:val="16"/>
+              </w:rPr>
+              <w:t>8</w:t>
+            </w:r>
+            <w:r>
+              <w:rPr>
+                <w:rFonts w:ascii="Aptos" w:eastAsia="Helvetica" w:hAnsi="Aptos" w:cs="Helvetica"/>
+                <w:color w:val="000000"/>
+                <w:sz w:val="16"/>
+                <w:szCs w:val="16"/>
+              </w:rPr>
+              <w:t xml:space="preserve"> </w:t>
+            </w:r>
+            <w:r>
+              <w:rPr>
+                <w:rFonts w:ascii="Aptos" w:eastAsia="Helvetica" w:hAnsi="Aptos" w:cs="Helvetica"/>
+                <w:color w:val="000000"/>
+                <w:sz w:val="16"/>
+                <w:szCs w:val="16"/>
+              </w:rPr>
+              <w:t>h</w:t>
+            </w:r>
+          </w:p>
+        </w:tc>
+        <w:tc>
+          <w:tcPr>
+            <w:tcW w:w="1260" w:type="dxa"/>
             <w:vAlign w:val="center"/>
           </w:tcPr>
           <w:p>
@@ -970,7 +1028,7 @@
         </w:tc>
         <w:tc>
           <w:tcPr>
-            <w:tcW w:w="1298" w:type="dxa"/>
+            <w:tcW w:w="1170" w:type="dxa"/>
             <w:vAlign w:val="center"/>
           </w:tcPr>
           <w:p>
@@ -1003,7 +1061,7 @@
         </w:tc>
         <w:tc>
           <w:tcPr>
-            <w:tcW w:w="1033" w:type="dxa"/>
+            <w:tcW w:w="990" w:type="dxa"/>
             <w:vAlign w:val="center"/>
           </w:tcPr>
           <w:p>
@@ -1036,7 +1094,7 @@
         </w:tc>
         <w:tc>
           <w:tcPr>
-            <w:tcW w:w="1033" w:type="dxa"/>
+            <w:tcW w:w="990" w:type="dxa"/>
             <w:vAlign w:val="center"/>
           </w:tcPr>
           <w:p>
@@ -1069,7 +1127,7 @@
         </w:tc>
         <w:tc>
           <w:tcPr>
-            <w:tcW w:w="1033" w:type="dxa"/>
+            <w:tcW w:w="990" w:type="dxa"/>
             <w:vAlign w:val="center"/>
           </w:tcPr>
           <w:p>
@@ -1102,7 +1160,7 @@
         </w:tc>
         <w:tc>
           <w:tcPr>
-            <w:tcW w:w="1620" w:type="dxa"/>
+            <w:tcW w:w="1465" w:type="dxa"/>
             <w:vAlign w:val="center"/>
           </w:tcPr>
           <w:p>
@@ -1140,7 +1198,7 @@
         </w:trPr>
         <w:tc>
           <w:tcPr>
-            <w:tcW w:w="1108" w:type="dxa"/>
+            <w:tcW w:w="1530" w:type="dxa"/>
             <w:vMerge/>
           </w:tcPr>
           <w:p>
@@ -1165,39 +1223,57 @@
         </w:tc>
         <w:tc>
           <w:tcPr>
-            <w:tcW w:w="692" w:type="dxa"/>
-          </w:tcPr>
-          <w:p>
-            <w:pPr>
-              <w:pBdr>
-                <w:top w:val="none" w:sz="0" w:space="0" w:color="000000"/>
-                <w:left w:val="none" w:sz="0" w:space="0" w:color="000000"/>
-                <w:bottom w:val="none" w:sz="0" w:space="0" w:color="000000"/>
-                <w:right w:val="none" w:sz="0" w:space="0" w:color="000000"/>
-              </w:pBdr>
-              <w:spacing w:before="100" w:after="100"/>
-              <w:ind w:left="100" w:right="100"/>
-              <w:rPr>
-                <w:rFonts w:ascii="Aptos" w:eastAsia="Helvetica" w:hAnsi="Aptos" w:cs="Helvetica"/>
-                <w:color w:val="000000"/>
-                <w:sz w:val="16"/>
-                <w:szCs w:val="16"/>
-              </w:rPr>
-            </w:pPr>
-            <w:r>
-              <w:rPr>
-                <w:rFonts w:ascii="Aptos" w:eastAsia="Helvetica" w:hAnsi="Aptos" w:cs="Helvetica"/>
-                <w:color w:val="000000"/>
-                <w:sz w:val="16"/>
-                <w:szCs w:val="16"/>
-              </w:rPr>
-              <w:t>16h</w:t>
-            </w:r>
-          </w:p>
-        </w:tc>
-        <w:tc>
-          <w:tcPr>
-            <w:tcW w:w="1298" w:type="dxa"/>
+            <w:tcW w:w="720" w:type="dxa"/>
+          </w:tcPr>
+          <w:p>
+            <w:pPr>
+              <w:pBdr>
+                <w:top w:val="none" w:sz="0" w:space="0" w:color="000000"/>
+                <w:left w:val="none" w:sz="0" w:space="0" w:color="000000"/>
+                <w:bottom w:val="none" w:sz="0" w:space="0" w:color="000000"/>
+                <w:right w:val="none" w:sz="0" w:space="0" w:color="000000"/>
+              </w:pBdr>
+              <w:spacing w:before="100" w:after="100"/>
+              <w:ind w:left="100" w:right="100"/>
+              <w:rPr>
+                <w:rFonts w:ascii="Aptos" w:eastAsia="Helvetica" w:hAnsi="Aptos" w:cs="Helvetica"/>
+                <w:color w:val="000000"/>
+                <w:sz w:val="16"/>
+                <w:szCs w:val="16"/>
+              </w:rPr>
+            </w:pPr>
+            <w:r>
+              <w:rPr>
+                <w:rFonts w:ascii="Aptos" w:eastAsia="Helvetica" w:hAnsi="Aptos" w:cs="Helvetica"/>
+                <w:color w:val="000000"/>
+                <w:sz w:val="16"/>
+                <w:szCs w:val="16"/>
+              </w:rPr>
+              <w:t>16</w:t>
+            </w:r>
+            <w:r>
+              <w:rPr>
+                <w:rFonts w:ascii="Aptos" w:eastAsia="Helvetica" w:hAnsi="Aptos" w:cs="Helvetica"/>
+                <w:color w:val="000000"/>
+                <w:sz w:val="16"/>
+                <w:szCs w:val="16"/>
+              </w:rPr>
+              <w:t xml:space="preserve"> </w:t>
+            </w:r>
+            <w:r>
+              <w:rPr>
+                <w:rFonts w:ascii="Aptos" w:eastAsia="Helvetica" w:hAnsi="Aptos" w:cs="Helvetica"/>
+                <w:color w:val="000000"/>
+                <w:sz w:val="16"/>
+                <w:szCs w:val="16"/>
+              </w:rPr>
+              <w:t>h</w:t>
+            </w:r>
+          </w:p>
+        </w:tc>
+        <w:tc>
+          <w:tcPr>
+            <w:tcW w:w="1260" w:type="dxa"/>
             <w:vAlign w:val="center"/>
           </w:tcPr>
           <w:p>
@@ -1230,7 +1306,7 @@
         </w:tc>
         <w:tc>
           <w:tcPr>
-            <w:tcW w:w="1298" w:type="dxa"/>
+            <w:tcW w:w="1170" w:type="dxa"/>
             <w:vAlign w:val="center"/>
           </w:tcPr>
           <w:p>
@@ -1263,7 +1339,7 @@
         </w:tc>
         <w:tc>
           <w:tcPr>
-            <w:tcW w:w="1033" w:type="dxa"/>
+            <w:tcW w:w="990" w:type="dxa"/>
             <w:vAlign w:val="center"/>
           </w:tcPr>
           <w:p>
@@ -1296,7 +1372,7 @@
         </w:tc>
         <w:tc>
           <w:tcPr>
-            <w:tcW w:w="1033" w:type="dxa"/>
+            <w:tcW w:w="990" w:type="dxa"/>
             <w:vAlign w:val="center"/>
           </w:tcPr>
           <w:p>
@@ -1329,7 +1405,7 @@
         </w:tc>
         <w:tc>
           <w:tcPr>
-            <w:tcW w:w="1033" w:type="dxa"/>
+            <w:tcW w:w="990" w:type="dxa"/>
             <w:vAlign w:val="center"/>
           </w:tcPr>
           <w:p>
@@ -1362,7 +1438,7 @@
         </w:tc>
         <w:tc>
           <w:tcPr>
-            <w:tcW w:w="1620" w:type="dxa"/>
+            <w:tcW w:w="1465" w:type="dxa"/>
             <w:vAlign w:val="center"/>
           </w:tcPr>
           <w:p>
@@ -1401,7 +1477,7 @@
         </w:trPr>
         <w:tc>
           <w:tcPr>
-            <w:tcW w:w="1108" w:type="dxa"/>
+            <w:tcW w:w="1530" w:type="dxa"/>
             <w:vMerge/>
           </w:tcPr>
           <w:p>
@@ -1426,39 +1502,57 @@
         </w:tc>
         <w:tc>
           <w:tcPr>
-            <w:tcW w:w="692" w:type="dxa"/>
-          </w:tcPr>
-          <w:p>
-            <w:pPr>
-              <w:pBdr>
-                <w:top w:val="none" w:sz="0" w:space="0" w:color="000000"/>
-                <w:left w:val="none" w:sz="0" w:space="0" w:color="000000"/>
-                <w:bottom w:val="none" w:sz="0" w:space="0" w:color="000000"/>
-                <w:right w:val="none" w:sz="0" w:space="0" w:color="000000"/>
-              </w:pBdr>
-              <w:spacing w:before="100" w:after="100"/>
-              <w:ind w:left="100" w:right="100"/>
-              <w:rPr>
-                <w:rFonts w:ascii="Aptos" w:eastAsia="Helvetica" w:hAnsi="Aptos" w:cs="Helvetica"/>
-                <w:color w:val="000000"/>
-                <w:sz w:val="16"/>
-                <w:szCs w:val="16"/>
-              </w:rPr>
-            </w:pPr>
-            <w:r>
-              <w:rPr>
-                <w:rFonts w:ascii="Aptos" w:eastAsia="Helvetica" w:hAnsi="Aptos" w:cs="Helvetica"/>
-                <w:color w:val="000000"/>
-                <w:sz w:val="16"/>
-                <w:szCs w:val="16"/>
-              </w:rPr>
-              <w:t>24h</w:t>
-            </w:r>
-          </w:p>
-        </w:tc>
-        <w:tc>
-          <w:tcPr>
-            <w:tcW w:w="1298" w:type="dxa"/>
+            <w:tcW w:w="720" w:type="dxa"/>
+          </w:tcPr>
+          <w:p>
+            <w:pPr>
+              <w:pBdr>
+                <w:top w:val="none" w:sz="0" w:space="0" w:color="000000"/>
+                <w:left w:val="none" w:sz="0" w:space="0" w:color="000000"/>
+                <w:bottom w:val="none" w:sz="0" w:space="0" w:color="000000"/>
+                <w:right w:val="none" w:sz="0" w:space="0" w:color="000000"/>
+              </w:pBdr>
+              <w:spacing w:before="100" w:after="100"/>
+              <w:ind w:left="100" w:right="100"/>
+              <w:rPr>
+                <w:rFonts w:ascii="Aptos" w:eastAsia="Helvetica" w:hAnsi="Aptos" w:cs="Helvetica"/>
+                <w:color w:val="000000"/>
+                <w:sz w:val="16"/>
+                <w:szCs w:val="16"/>
+              </w:rPr>
+            </w:pPr>
+            <w:r>
+              <w:rPr>
+                <w:rFonts w:ascii="Aptos" w:eastAsia="Helvetica" w:hAnsi="Aptos" w:cs="Helvetica"/>
+                <w:color w:val="000000"/>
+                <w:sz w:val="16"/>
+                <w:szCs w:val="16"/>
+              </w:rPr>
+              <w:t>24</w:t>
+            </w:r>
+            <w:r>
+              <w:rPr>
+                <w:rFonts w:ascii="Aptos" w:eastAsia="Helvetica" w:hAnsi="Aptos" w:cs="Helvetica"/>
+                <w:color w:val="000000"/>
+                <w:sz w:val="16"/>
+                <w:szCs w:val="16"/>
+              </w:rPr>
+              <w:t xml:space="preserve"> </w:t>
+            </w:r>
+            <w:r>
+              <w:rPr>
+                <w:rFonts w:ascii="Aptos" w:eastAsia="Helvetica" w:hAnsi="Aptos" w:cs="Helvetica"/>
+                <w:color w:val="000000"/>
+                <w:sz w:val="16"/>
+                <w:szCs w:val="16"/>
+              </w:rPr>
+              <w:t>h</w:t>
+            </w:r>
+          </w:p>
+        </w:tc>
+        <w:tc>
+          <w:tcPr>
+            <w:tcW w:w="1260" w:type="dxa"/>
             <w:vAlign w:val="center"/>
           </w:tcPr>
           <w:p>
@@ -1491,7 +1585,7 @@
         </w:tc>
         <w:tc>
           <w:tcPr>
-            <w:tcW w:w="1298" w:type="dxa"/>
+            <w:tcW w:w="1170" w:type="dxa"/>
             <w:vAlign w:val="center"/>
           </w:tcPr>
           <w:p>
@@ -1524,7 +1618,7 @@
         </w:tc>
         <w:tc>
           <w:tcPr>
-            <w:tcW w:w="1033" w:type="dxa"/>
+            <w:tcW w:w="990" w:type="dxa"/>
             <w:vAlign w:val="center"/>
           </w:tcPr>
           <w:p>
@@ -1557,7 +1651,7 @@
         </w:tc>
         <w:tc>
           <w:tcPr>
-            <w:tcW w:w="1033" w:type="dxa"/>
+            <w:tcW w:w="990" w:type="dxa"/>
             <w:vAlign w:val="center"/>
           </w:tcPr>
           <w:p>
@@ -1590,7 +1684,7 @@
         </w:tc>
         <w:tc>
           <w:tcPr>
-            <w:tcW w:w="1033" w:type="dxa"/>
+            <w:tcW w:w="990" w:type="dxa"/>
             <w:vAlign w:val="center"/>
           </w:tcPr>
           <w:p>
@@ -1623,7 +1717,7 @@
         </w:tc>
         <w:tc>
           <w:tcPr>
-            <w:tcW w:w="1620" w:type="dxa"/>
+            <w:tcW w:w="1465" w:type="dxa"/>
             <w:vAlign w:val="center"/>
           </w:tcPr>
           <w:p>
@@ -1661,7 +1755,7 @@
         </w:trPr>
         <w:tc>
           <w:tcPr>
-            <w:tcW w:w="1108" w:type="dxa"/>
+            <w:tcW w:w="1530" w:type="dxa"/>
             <w:vMerge/>
           </w:tcPr>
           <w:p>
@@ -1686,39 +1780,57 @@
         </w:tc>
         <w:tc>
           <w:tcPr>
-            <w:tcW w:w="692" w:type="dxa"/>
-          </w:tcPr>
-          <w:p>
-            <w:pPr>
-              <w:pBdr>
-                <w:top w:val="none" w:sz="0" w:space="0" w:color="000000"/>
-                <w:left w:val="none" w:sz="0" w:space="0" w:color="000000"/>
-                <w:bottom w:val="none" w:sz="0" w:space="0" w:color="000000"/>
-                <w:right w:val="none" w:sz="0" w:space="0" w:color="000000"/>
-              </w:pBdr>
-              <w:spacing w:before="100" w:after="100"/>
-              <w:ind w:left="100" w:right="100"/>
-              <w:rPr>
-                <w:rFonts w:ascii="Aptos" w:eastAsia="Helvetica" w:hAnsi="Aptos" w:cs="Helvetica"/>
-                <w:color w:val="000000"/>
-                <w:sz w:val="16"/>
-                <w:szCs w:val="16"/>
-              </w:rPr>
-            </w:pPr>
-            <w:r>
-              <w:rPr>
-                <w:rFonts w:ascii="Aptos" w:eastAsia="Helvetica" w:hAnsi="Aptos" w:cs="Helvetica"/>
-                <w:color w:val="000000"/>
-                <w:sz w:val="16"/>
-                <w:szCs w:val="16"/>
-              </w:rPr>
-              <w:t>48h</w:t>
-            </w:r>
-          </w:p>
-        </w:tc>
-        <w:tc>
-          <w:tcPr>
-            <w:tcW w:w="1298" w:type="dxa"/>
+            <w:tcW w:w="720" w:type="dxa"/>
+          </w:tcPr>
+          <w:p>
+            <w:pPr>
+              <w:pBdr>
+                <w:top w:val="none" w:sz="0" w:space="0" w:color="000000"/>
+                <w:left w:val="none" w:sz="0" w:space="0" w:color="000000"/>
+                <w:bottom w:val="none" w:sz="0" w:space="0" w:color="000000"/>
+                <w:right w:val="none" w:sz="0" w:space="0" w:color="000000"/>
+              </w:pBdr>
+              <w:spacing w:before="100" w:after="100"/>
+              <w:ind w:left="100" w:right="100"/>
+              <w:rPr>
+                <w:rFonts w:ascii="Aptos" w:eastAsia="Helvetica" w:hAnsi="Aptos" w:cs="Helvetica"/>
+                <w:color w:val="000000"/>
+                <w:sz w:val="16"/>
+                <w:szCs w:val="16"/>
+              </w:rPr>
+            </w:pPr>
+            <w:r>
+              <w:rPr>
+                <w:rFonts w:ascii="Aptos" w:eastAsia="Helvetica" w:hAnsi="Aptos" w:cs="Helvetica"/>
+                <w:color w:val="000000"/>
+                <w:sz w:val="16"/>
+                <w:szCs w:val="16"/>
+              </w:rPr>
+              <w:t>48</w:t>
+            </w:r>
+            <w:r>
+              <w:rPr>
+                <w:rFonts w:ascii="Aptos" w:eastAsia="Helvetica" w:hAnsi="Aptos" w:cs="Helvetica"/>
+                <w:color w:val="000000"/>
+                <w:sz w:val="16"/>
+                <w:szCs w:val="16"/>
+              </w:rPr>
+              <w:t xml:space="preserve"> </w:t>
+            </w:r>
+            <w:r>
+              <w:rPr>
+                <w:rFonts w:ascii="Aptos" w:eastAsia="Helvetica" w:hAnsi="Aptos" w:cs="Helvetica"/>
+                <w:color w:val="000000"/>
+                <w:sz w:val="16"/>
+                <w:szCs w:val="16"/>
+              </w:rPr>
+              <w:t>h</w:t>
+            </w:r>
+          </w:p>
+        </w:tc>
+        <w:tc>
+          <w:tcPr>
+            <w:tcW w:w="1260" w:type="dxa"/>
             <w:vAlign w:val="center"/>
           </w:tcPr>
           <w:p>
@@ -1751,7 +1863,7 @@
         </w:tc>
         <w:tc>
           <w:tcPr>
-            <w:tcW w:w="1298" w:type="dxa"/>
+            <w:tcW w:w="1170" w:type="dxa"/>
             <w:vAlign w:val="center"/>
           </w:tcPr>
           <w:p>
@@ -1784,7 +1896,7 @@
         </w:tc>
         <w:tc>
           <w:tcPr>
-            <w:tcW w:w="1033" w:type="dxa"/>
+            <w:tcW w:w="990" w:type="dxa"/>
             <w:vAlign w:val="center"/>
           </w:tcPr>
           <w:p>
@@ -1817,7 +1929,7 @@
         </w:tc>
         <w:tc>
           <w:tcPr>
-            <w:tcW w:w="1033" w:type="dxa"/>
+            <w:tcW w:w="990" w:type="dxa"/>
             <w:vAlign w:val="center"/>
           </w:tcPr>
           <w:p>
@@ -1850,7 +1962,7 @@
         </w:tc>
         <w:tc>
           <w:tcPr>
-            <w:tcW w:w="1033" w:type="dxa"/>
+            <w:tcW w:w="990" w:type="dxa"/>
             <w:vAlign w:val="center"/>
           </w:tcPr>
           <w:p>
@@ -1883,7 +1995,7 @@
         </w:tc>
         <w:tc>
           <w:tcPr>
-            <w:tcW w:w="1620" w:type="dxa"/>
+            <w:tcW w:w="1465" w:type="dxa"/>
             <w:vAlign w:val="center"/>
           </w:tcPr>
           <w:p>
@@ -1922,7 +2034,7 @@
         </w:trPr>
         <w:tc>
           <w:tcPr>
-            <w:tcW w:w="1108" w:type="dxa"/>
+            <w:tcW w:w="1530" w:type="dxa"/>
             <w:vMerge/>
           </w:tcPr>
           <w:p>
@@ -1947,39 +2059,57 @@
         </w:tc>
         <w:tc>
           <w:tcPr>
-            <w:tcW w:w="692" w:type="dxa"/>
-          </w:tcPr>
-          <w:p>
-            <w:pPr>
-              <w:pBdr>
-                <w:top w:val="none" w:sz="0" w:space="0" w:color="000000"/>
-                <w:left w:val="none" w:sz="0" w:space="0" w:color="000000"/>
-                <w:bottom w:val="none" w:sz="0" w:space="0" w:color="000000"/>
-                <w:right w:val="none" w:sz="0" w:space="0" w:color="000000"/>
-              </w:pBdr>
-              <w:spacing w:before="100" w:after="100"/>
-              <w:ind w:left="100" w:right="100"/>
-              <w:rPr>
-                <w:rFonts w:ascii="Aptos" w:eastAsia="Helvetica" w:hAnsi="Aptos" w:cs="Helvetica"/>
-                <w:color w:val="000000"/>
-                <w:sz w:val="16"/>
-                <w:szCs w:val="16"/>
-              </w:rPr>
-            </w:pPr>
-            <w:r>
-              <w:rPr>
-                <w:rFonts w:ascii="Aptos" w:eastAsia="Helvetica" w:hAnsi="Aptos" w:cs="Helvetica"/>
-                <w:color w:val="000000"/>
-                <w:sz w:val="16"/>
-                <w:szCs w:val="16"/>
-              </w:rPr>
-              <w:t>72h</w:t>
-            </w:r>
-          </w:p>
-        </w:tc>
-        <w:tc>
-          <w:tcPr>
-            <w:tcW w:w="1298" w:type="dxa"/>
+            <w:tcW w:w="720" w:type="dxa"/>
+          </w:tcPr>
+          <w:p>
+            <w:pPr>
+              <w:pBdr>
+                <w:top w:val="none" w:sz="0" w:space="0" w:color="000000"/>
+                <w:left w:val="none" w:sz="0" w:space="0" w:color="000000"/>
+                <w:bottom w:val="none" w:sz="0" w:space="0" w:color="000000"/>
+                <w:right w:val="none" w:sz="0" w:space="0" w:color="000000"/>
+              </w:pBdr>
+              <w:spacing w:before="100" w:after="100"/>
+              <w:ind w:left="100" w:right="100"/>
+              <w:rPr>
+                <w:rFonts w:ascii="Aptos" w:eastAsia="Helvetica" w:hAnsi="Aptos" w:cs="Helvetica"/>
+                <w:color w:val="000000"/>
+                <w:sz w:val="16"/>
+                <w:szCs w:val="16"/>
+              </w:rPr>
+            </w:pPr>
+            <w:r>
+              <w:rPr>
+                <w:rFonts w:ascii="Aptos" w:eastAsia="Helvetica" w:hAnsi="Aptos" w:cs="Helvetica"/>
+                <w:color w:val="000000"/>
+                <w:sz w:val="16"/>
+                <w:szCs w:val="16"/>
+              </w:rPr>
+              <w:t>72</w:t>
+            </w:r>
+            <w:r>
+              <w:rPr>
+                <w:rFonts w:ascii="Aptos" w:eastAsia="Helvetica" w:hAnsi="Aptos" w:cs="Helvetica"/>
+                <w:color w:val="000000"/>
+                <w:sz w:val="16"/>
+                <w:szCs w:val="16"/>
+              </w:rPr>
+              <w:t xml:space="preserve"> </w:t>
+            </w:r>
+            <w:r>
+              <w:rPr>
+                <w:rFonts w:ascii="Aptos" w:eastAsia="Helvetica" w:hAnsi="Aptos" w:cs="Helvetica"/>
+                <w:color w:val="000000"/>
+                <w:sz w:val="16"/>
+                <w:szCs w:val="16"/>
+              </w:rPr>
+              <w:t>h</w:t>
+            </w:r>
+          </w:p>
+        </w:tc>
+        <w:tc>
+          <w:tcPr>
+            <w:tcW w:w="1260" w:type="dxa"/>
             <w:vAlign w:val="center"/>
           </w:tcPr>
           <w:p>
@@ -2012,7 +2142,7 @@
         </w:tc>
         <w:tc>
           <w:tcPr>
-            <w:tcW w:w="1298" w:type="dxa"/>
+            <w:tcW w:w="1170" w:type="dxa"/>
             <w:vAlign w:val="center"/>
           </w:tcPr>
           <w:p>
@@ -2045,7 +2175,7 @@
         </w:tc>
         <w:tc>
           <w:tcPr>
-            <w:tcW w:w="1033" w:type="dxa"/>
+            <w:tcW w:w="990" w:type="dxa"/>
             <w:vAlign w:val="center"/>
           </w:tcPr>
           <w:p>
@@ -2078,7 +2208,7 @@
         </w:tc>
         <w:tc>
           <w:tcPr>
-            <w:tcW w:w="1033" w:type="dxa"/>
+            <w:tcW w:w="990" w:type="dxa"/>
             <w:vAlign w:val="center"/>
           </w:tcPr>
           <w:p>
@@ -2111,7 +2241,7 @@
         </w:tc>
         <w:tc>
           <w:tcPr>
-            <w:tcW w:w="1033" w:type="dxa"/>
+            <w:tcW w:w="990" w:type="dxa"/>
             <w:vAlign w:val="center"/>
           </w:tcPr>
           <w:p>
@@ -2144,7 +2274,7 @@
         </w:tc>
         <w:tc>
           <w:tcPr>
-            <w:tcW w:w="1620" w:type="dxa"/>
+            <w:tcW w:w="1465" w:type="dxa"/>
             <w:vAlign w:val="center"/>
           </w:tcPr>
           <w:p>
@@ -2182,7 +2312,7 @@
         </w:trPr>
         <w:tc>
           <w:tcPr>
-            <w:tcW w:w="1108" w:type="dxa"/>
+            <w:tcW w:w="1530" w:type="dxa"/>
           </w:tcPr>
           <w:p>
             <w:pPr>
@@ -2216,7 +2346,7 @@
         </w:tc>
         <w:tc>
           <w:tcPr>
-            <w:tcW w:w="692" w:type="dxa"/>
+            <w:tcW w:w="720" w:type="dxa"/>
           </w:tcPr>
           <w:p>
             <w:pPr>
@@ -2239,7 +2369,7 @@
         </w:tc>
         <w:tc>
           <w:tcPr>
-            <w:tcW w:w="1298" w:type="dxa"/>
+            <w:tcW w:w="1260" w:type="dxa"/>
           </w:tcPr>
           <w:p>
             <w:pPr>
@@ -2314,7 +2444,43 @@
                 <w:sz w:val="16"/>
                 <w:szCs w:val="16"/>
               </w:rPr>
-              <w:t>50; (2) BMDU/BMD </w:t>
+              <w:t xml:space="preserve">50; (2) </w:t>
+            </w:r>
+            <w:r>
+              <w:rPr>
+                <w:rFonts w:ascii="Aptos" w:eastAsia="Times New Roman" w:hAnsi="Aptos" w:cs="Segoe UI"/>
+                <w:color w:val="000000"/>
+                <w:sz w:val="16"/>
+                <w:szCs w:val="16"/>
+              </w:rPr>
+              <w:t>BMCU</w:t>
+            </w:r>
+            <w:r>
+              <w:rPr>
+                <w:rFonts w:ascii="Aptos" w:eastAsia="Times New Roman" w:hAnsi="Aptos" w:cs="Segoe UI"/>
+                <w:color w:val="000000"/>
+                <w:sz w:val="16"/>
+                <w:szCs w:val="16"/>
+              </w:rPr>
+              <w:t>/BM</w:t>
+            </w:r>
+            <w:r>
+              <w:rPr>
+                <w:rFonts w:ascii="Aptos" w:eastAsia="Times New Roman" w:hAnsi="Aptos" w:cs="Segoe UI"/>
+                <w:color w:val="000000"/>
+                <w:sz w:val="16"/>
+                <w:szCs w:val="16"/>
+              </w:rPr>
+              <w:t>C</w:t>
+            </w:r>
+            <w:r>
+              <w:rPr>
+                <w:rFonts w:ascii="Aptos" w:eastAsia="Times New Roman" w:hAnsi="Aptos" w:cs="Segoe UI"/>
+                <w:color w:val="000000"/>
+                <w:sz w:val="16"/>
+                <w:szCs w:val="16"/>
+              </w:rPr>
+              <w:t> </w:t>
             </w:r>
             <w:r>
               <w:rPr>
@@ -2333,7 +2499,43 @@
                 <w:sz w:val="16"/>
                 <w:szCs w:val="16"/>
               </w:rPr>
-              <w:t> 20; (3) BMD/BMDL </w:t>
+              <w:t> 20; (3) BM</w:t>
+            </w:r>
+            <w:r>
+              <w:rPr>
+                <w:rFonts w:ascii="Aptos" w:eastAsia="Times New Roman" w:hAnsi="Aptos" w:cs="Segoe UI"/>
+                <w:color w:val="000000"/>
+                <w:sz w:val="16"/>
+                <w:szCs w:val="16"/>
+              </w:rPr>
+              <w:t>C</w:t>
+            </w:r>
+            <w:r>
+              <w:rPr>
+                <w:rFonts w:ascii="Aptos" w:eastAsia="Times New Roman" w:hAnsi="Aptos" w:cs="Segoe UI"/>
+                <w:color w:val="000000"/>
+                <w:sz w:val="16"/>
+                <w:szCs w:val="16"/>
+              </w:rPr>
+              <w:t>/BM</w:t>
+            </w:r>
+            <w:r>
+              <w:rPr>
+                <w:rFonts w:ascii="Aptos" w:eastAsia="Times New Roman" w:hAnsi="Aptos" w:cs="Segoe UI"/>
+                <w:color w:val="000000"/>
+                <w:sz w:val="16"/>
+                <w:szCs w:val="16"/>
+              </w:rPr>
+              <w:t>C</w:t>
+            </w:r>
+            <w:r>
+              <w:rPr>
+                <w:rFonts w:ascii="Aptos" w:eastAsia="Times New Roman" w:hAnsi="Aptos" w:cs="Segoe UI"/>
+                <w:color w:val="000000"/>
+                <w:sz w:val="16"/>
+                <w:szCs w:val="16"/>
+              </w:rPr>
+              <w:t>L </w:t>
             </w:r>
             <w:r>
               <w:rPr>
@@ -2352,38 +2554,7 @@
                 <w:sz w:val="16"/>
                 <w:szCs w:val="16"/>
               </w:rPr>
-              <w:t> 20; (4</w:t>
-            </w:r>
-            <w:proofErr w:type="gramStart"/>
-            <w:r>
-              <w:rPr>
-                <w:rFonts w:ascii="Aptos" w:eastAsia="Times New Roman" w:hAnsi="Aptos" w:cs="Segoe UI"/>
-                <w:color w:val="000000"/>
-                <w:sz w:val="16"/>
-                <w:szCs w:val="16"/>
-              </w:rPr>
-              <w:t>)  </w:t>
-            </w:r>
-            <w:proofErr w:type="spellStart"/>
-            <w:r>
-              <w:rPr>
-                <w:rFonts w:ascii="Aptos" w:eastAsia="Times New Roman" w:hAnsi="Aptos" w:cs="Segoe UI"/>
-                <w:color w:val="000000"/>
-                <w:sz w:val="16"/>
-                <w:szCs w:val="16"/>
-              </w:rPr>
-              <w:t>Rsquared</w:t>
-            </w:r>
-            <w:proofErr w:type="spellEnd"/>
-            <w:proofErr w:type="gramEnd"/>
-            <w:r>
-              <w:rPr>
-                <w:rFonts w:ascii="Aptos" w:eastAsia="Times New Roman" w:hAnsi="Aptos" w:cs="Segoe UI"/>
-                <w:color w:val="000000"/>
-                <w:sz w:val="16"/>
-                <w:szCs w:val="16"/>
-              </w:rPr>
-              <w:t> </w:t>
+              <w:t> 20; (4)  Rsquared </w:t>
             </w:r>
             <w:r>
               <w:rPr>
@@ -2408,7 +2579,7 @@
         </w:tc>
         <w:tc>
           <w:tcPr>
-            <w:tcW w:w="1298" w:type="dxa"/>
+            <w:tcW w:w="1170" w:type="dxa"/>
           </w:tcPr>
           <w:p>
             <w:pPr>
@@ -2443,7 +2614,7 @@
                 <w:sz w:val="16"/>
                 <w:szCs w:val="16"/>
               </w:rPr>
-              <w:t>) BMD &lt; 50 uM; (</w:t>
+              <w:t>) BM</w:t>
             </w:r>
             <w:r>
               <w:rPr>
@@ -2452,6 +2623,24 @@
                 <w:sz w:val="16"/>
                 <w:szCs w:val="16"/>
               </w:rPr>
+              <w:t>C</w:t>
+            </w:r>
+            <w:r>
+              <w:rPr>
+                <w:rFonts w:ascii="Aptos" w:eastAsia="Times New Roman" w:hAnsi="Aptos" w:cs="Segoe UI"/>
+                <w:color w:val="000000"/>
+                <w:sz w:val="16"/>
+                <w:szCs w:val="16"/>
+              </w:rPr>
+              <w:t xml:space="preserve"> &lt; 50 uM; (</w:t>
+            </w:r>
+            <w:r>
+              <w:rPr>
+                <w:rFonts w:ascii="Aptos" w:eastAsia="Times New Roman" w:hAnsi="Aptos" w:cs="Segoe UI"/>
+                <w:color w:val="000000"/>
+                <w:sz w:val="16"/>
+                <w:szCs w:val="16"/>
+              </w:rPr>
               <w:t>2</w:t>
             </w:r>
             <w:r>
@@ -2461,7 +2650,43 @@
                 <w:sz w:val="16"/>
                 <w:szCs w:val="16"/>
               </w:rPr>
-              <w:t>) BMDU/BMDL </w:t>
+              <w:t>) </w:t>
+            </w:r>
+            <w:r>
+              <w:rPr>
+                <w:rFonts w:ascii="Aptos" w:eastAsia="Times New Roman" w:hAnsi="Aptos" w:cs="Segoe UI"/>
+                <w:color w:val="000000"/>
+                <w:sz w:val="16"/>
+                <w:szCs w:val="16"/>
+              </w:rPr>
+              <w:t>BMCU</w:t>
+            </w:r>
+            <w:r>
+              <w:rPr>
+                <w:rFonts w:ascii="Aptos" w:eastAsia="Times New Roman" w:hAnsi="Aptos" w:cs="Segoe UI"/>
+                <w:color w:val="000000"/>
+                <w:sz w:val="16"/>
+                <w:szCs w:val="16"/>
+              </w:rPr>
+              <w:t>/BM</w:t>
+            </w:r>
+            <w:r>
+              <w:rPr>
+                <w:rFonts w:ascii="Aptos" w:eastAsia="Times New Roman" w:hAnsi="Aptos" w:cs="Segoe UI"/>
+                <w:color w:val="000000"/>
+                <w:sz w:val="16"/>
+                <w:szCs w:val="16"/>
+              </w:rPr>
+              <w:t>C</w:t>
+            </w:r>
+            <w:r>
+              <w:rPr>
+                <w:rFonts w:ascii="Aptos" w:eastAsia="Times New Roman" w:hAnsi="Aptos" w:cs="Segoe UI"/>
+                <w:color w:val="000000"/>
+                <w:sz w:val="16"/>
+                <w:szCs w:val="16"/>
+              </w:rPr>
+              <w:t>L </w:t>
             </w:r>
             <w:r>
               <w:rPr>
@@ -2498,7 +2723,43 @@
                 <w:sz w:val="16"/>
                 <w:szCs w:val="16"/>
               </w:rPr>
-              <w:t>) BMD/BMDL </w:t>
+              <w:t>) BM</w:t>
+            </w:r>
+            <w:r>
+              <w:rPr>
+                <w:rFonts w:ascii="Aptos" w:eastAsia="Times New Roman" w:hAnsi="Aptos" w:cs="Segoe UI"/>
+                <w:color w:val="000000"/>
+                <w:sz w:val="16"/>
+                <w:szCs w:val="16"/>
+              </w:rPr>
+              <w:t>C</w:t>
+            </w:r>
+            <w:r>
+              <w:rPr>
+                <w:rFonts w:ascii="Aptos" w:eastAsia="Times New Roman" w:hAnsi="Aptos" w:cs="Segoe UI"/>
+                <w:color w:val="000000"/>
+                <w:sz w:val="16"/>
+                <w:szCs w:val="16"/>
+              </w:rPr>
+              <w:t>/BM</w:t>
+            </w:r>
+            <w:r>
+              <w:rPr>
+                <w:rFonts w:ascii="Aptos" w:eastAsia="Times New Roman" w:hAnsi="Aptos" w:cs="Segoe UI"/>
+                <w:color w:val="000000"/>
+                <w:sz w:val="16"/>
+                <w:szCs w:val="16"/>
+              </w:rPr>
+              <w:t>C</w:t>
+            </w:r>
+            <w:r>
+              <w:rPr>
+                <w:rFonts w:ascii="Aptos" w:eastAsia="Times New Roman" w:hAnsi="Aptos" w:cs="Segoe UI"/>
+                <w:color w:val="000000"/>
+                <w:sz w:val="16"/>
+                <w:szCs w:val="16"/>
+              </w:rPr>
+              <w:t>L </w:t>
             </w:r>
             <w:r>
               <w:rPr>
@@ -2560,39 +2821,57 @@
         </w:tc>
         <w:tc>
           <w:tcPr>
-            <w:tcW w:w="1033" w:type="dxa"/>
-          </w:tcPr>
-          <w:p>
-            <w:pPr>
-              <w:pBdr>
-                <w:top w:val="none" w:sz="0" w:space="0" w:color="000000"/>
-                <w:left w:val="none" w:sz="0" w:space="0" w:color="000000"/>
-                <w:bottom w:val="none" w:sz="0" w:space="0" w:color="000000"/>
-                <w:right w:val="none" w:sz="0" w:space="0" w:color="000000"/>
-              </w:pBdr>
-              <w:spacing w:before="100" w:after="100"/>
-              <w:ind w:left="100" w:right="100"/>
-              <w:rPr>
-                <w:rFonts w:ascii="Aptos" w:eastAsia="Helvetica" w:hAnsi="Aptos" w:cs="Helvetica"/>
-                <w:color w:val="000000"/>
-                <w:sz w:val="16"/>
-                <w:szCs w:val="16"/>
-              </w:rPr>
-            </w:pPr>
-            <w:r>
-              <w:rPr>
-                <w:rFonts w:ascii="Aptos" w:eastAsia="Helvetica" w:hAnsi="Aptos" w:cs="Helvetica"/>
-                <w:color w:val="000000"/>
-                <w:sz w:val="16"/>
-                <w:szCs w:val="16"/>
-              </w:rPr>
-              <w:t>(1) Finite BMD point estimates &amp; CI bounds</w:t>
-            </w:r>
-          </w:p>
-        </w:tc>
-        <w:tc>
-          <w:tcPr>
-            <w:tcW w:w="1033" w:type="dxa"/>
+            <w:tcW w:w="990" w:type="dxa"/>
+          </w:tcPr>
+          <w:p>
+            <w:pPr>
+              <w:pBdr>
+                <w:top w:val="none" w:sz="0" w:space="0" w:color="000000"/>
+                <w:left w:val="none" w:sz="0" w:space="0" w:color="000000"/>
+                <w:bottom w:val="none" w:sz="0" w:space="0" w:color="000000"/>
+                <w:right w:val="none" w:sz="0" w:space="0" w:color="000000"/>
+              </w:pBdr>
+              <w:spacing w:before="100" w:after="100"/>
+              <w:ind w:left="100" w:right="100"/>
+              <w:rPr>
+                <w:rFonts w:ascii="Aptos" w:eastAsia="Helvetica" w:hAnsi="Aptos" w:cs="Helvetica"/>
+                <w:color w:val="000000"/>
+                <w:sz w:val="16"/>
+                <w:szCs w:val="16"/>
+              </w:rPr>
+            </w:pPr>
+            <w:r>
+              <w:rPr>
+                <w:rFonts w:ascii="Aptos" w:eastAsia="Helvetica" w:hAnsi="Aptos" w:cs="Helvetica"/>
+                <w:color w:val="000000"/>
+                <w:sz w:val="16"/>
+                <w:szCs w:val="16"/>
+              </w:rPr>
+              <w:t>(1) Finite BM</w:t>
+            </w:r>
+            <w:r>
+              <w:rPr>
+                <w:rFonts w:ascii="Aptos" w:eastAsia="Helvetica" w:hAnsi="Aptos" w:cs="Helvetica"/>
+                <w:color w:val="000000"/>
+                <w:sz w:val="16"/>
+                <w:szCs w:val="16"/>
+              </w:rPr>
+              <w:t>C</w:t>
+            </w:r>
+            <w:r>
+              <w:rPr>
+                <w:rFonts w:ascii="Aptos" w:eastAsia="Helvetica" w:hAnsi="Aptos" w:cs="Helvetica"/>
+                <w:color w:val="000000"/>
+                <w:sz w:val="16"/>
+                <w:szCs w:val="16"/>
+              </w:rPr>
+              <w:t xml:space="preserve"> point estimates &amp; CI bounds</w:t>
+            </w:r>
+          </w:p>
+        </w:tc>
+        <w:tc>
+          <w:tcPr>
+            <w:tcW w:w="990" w:type="dxa"/>
           </w:tcPr>
           <w:p>
             <w:pPr>
@@ -2624,39 +2903,57 @@
         </w:tc>
         <w:tc>
           <w:tcPr>
-            <w:tcW w:w="1033" w:type="dxa"/>
-          </w:tcPr>
-          <w:p>
-            <w:pPr>
-              <w:pBdr>
-                <w:top w:val="none" w:sz="0" w:space="0" w:color="000000"/>
-                <w:left w:val="none" w:sz="0" w:space="0" w:color="000000"/>
-                <w:bottom w:val="none" w:sz="0" w:space="0" w:color="000000"/>
-                <w:right w:val="none" w:sz="0" w:space="0" w:color="000000"/>
-              </w:pBdr>
-              <w:spacing w:before="100" w:after="100"/>
-              <w:ind w:left="100" w:right="100"/>
-              <w:rPr>
-                <w:rFonts w:ascii="Aptos" w:eastAsia="Helvetica" w:hAnsi="Aptos" w:cs="Helvetica"/>
-                <w:color w:val="000000"/>
-                <w:sz w:val="16"/>
-                <w:szCs w:val="16"/>
-              </w:rPr>
-            </w:pPr>
-            <w:r>
-              <w:rPr>
-                <w:rFonts w:ascii="Aptos" w:eastAsia="Helvetica" w:hAnsi="Aptos" w:cs="Helvetica"/>
-                <w:color w:val="000000"/>
-                <w:sz w:val="16"/>
-                <w:szCs w:val="16"/>
-              </w:rPr>
-              <w:t>(1) Finite BMD point estimates &amp; CI bounds</w:t>
-            </w:r>
-          </w:p>
-        </w:tc>
-        <w:tc>
-          <w:tcPr>
-            <w:tcW w:w="1620" w:type="dxa"/>
+            <w:tcW w:w="990" w:type="dxa"/>
+          </w:tcPr>
+          <w:p>
+            <w:pPr>
+              <w:pBdr>
+                <w:top w:val="none" w:sz="0" w:space="0" w:color="000000"/>
+                <w:left w:val="none" w:sz="0" w:space="0" w:color="000000"/>
+                <w:bottom w:val="none" w:sz="0" w:space="0" w:color="000000"/>
+                <w:right w:val="none" w:sz="0" w:space="0" w:color="000000"/>
+              </w:pBdr>
+              <w:spacing w:before="100" w:after="100"/>
+              <w:ind w:left="100" w:right="100"/>
+              <w:rPr>
+                <w:rFonts w:ascii="Aptos" w:eastAsia="Helvetica" w:hAnsi="Aptos" w:cs="Helvetica"/>
+                <w:color w:val="000000"/>
+                <w:sz w:val="16"/>
+                <w:szCs w:val="16"/>
+              </w:rPr>
+            </w:pPr>
+            <w:r>
+              <w:rPr>
+                <w:rFonts w:ascii="Aptos" w:eastAsia="Helvetica" w:hAnsi="Aptos" w:cs="Helvetica"/>
+                <w:color w:val="000000"/>
+                <w:sz w:val="16"/>
+                <w:szCs w:val="16"/>
+              </w:rPr>
+              <w:t>(1) Finite BM</w:t>
+            </w:r>
+            <w:r>
+              <w:rPr>
+                <w:rFonts w:ascii="Aptos" w:eastAsia="Helvetica" w:hAnsi="Aptos" w:cs="Helvetica"/>
+                <w:color w:val="000000"/>
+                <w:sz w:val="16"/>
+                <w:szCs w:val="16"/>
+              </w:rPr>
+              <w:t>C</w:t>
+            </w:r>
+            <w:r>
+              <w:rPr>
+                <w:rFonts w:ascii="Aptos" w:eastAsia="Helvetica" w:hAnsi="Aptos" w:cs="Helvetica"/>
+                <w:color w:val="000000"/>
+                <w:sz w:val="16"/>
+                <w:szCs w:val="16"/>
+              </w:rPr>
+              <w:t xml:space="preserve"> point estimates &amp; CI bounds</w:t>
+            </w:r>
+          </w:p>
+        </w:tc>
+        <w:tc>
+          <w:tcPr>
+            <w:tcW w:w="1465" w:type="dxa"/>
           </w:tcPr>
           <w:p>
             <w:pPr>
@@ -2685,7 +2982,7 @@
         </w:trPr>
         <w:tc>
           <w:tcPr>
-            <w:tcW w:w="1108" w:type="dxa"/>
+            <w:tcW w:w="1530" w:type="dxa"/>
             <w:vMerge w:val="restart"/>
           </w:tcPr>
           <w:p>
@@ -2720,7 +3017,7 @@
         </w:tc>
         <w:tc>
           <w:tcPr>
-            <w:tcW w:w="692" w:type="dxa"/>
+            <w:tcW w:w="720" w:type="dxa"/>
           </w:tcPr>
           <w:p>
             <w:pPr>
@@ -2752,7 +3049,7 @@
         </w:tc>
         <w:tc>
           <w:tcPr>
-            <w:tcW w:w="1298" w:type="dxa"/>
+            <w:tcW w:w="1260" w:type="dxa"/>
             <w:vAlign w:val="center"/>
           </w:tcPr>
           <w:p>
@@ -2785,7 +3082,7 @@
         </w:tc>
         <w:tc>
           <w:tcPr>
-            <w:tcW w:w="1298" w:type="dxa"/>
+            <w:tcW w:w="1170" w:type="dxa"/>
             <w:vAlign w:val="center"/>
           </w:tcPr>
           <w:p>
@@ -2818,7 +3115,7 @@
         </w:tc>
         <w:tc>
           <w:tcPr>
-            <w:tcW w:w="1033" w:type="dxa"/>
+            <w:tcW w:w="990" w:type="dxa"/>
             <w:vAlign w:val="center"/>
           </w:tcPr>
           <w:p>
@@ -2851,7 +3148,7 @@
         </w:tc>
         <w:tc>
           <w:tcPr>
-            <w:tcW w:w="1033" w:type="dxa"/>
+            <w:tcW w:w="990" w:type="dxa"/>
             <w:vAlign w:val="center"/>
           </w:tcPr>
           <w:p>
@@ -2884,7 +3181,7 @@
         </w:tc>
         <w:tc>
           <w:tcPr>
-            <w:tcW w:w="1033" w:type="dxa"/>
+            <w:tcW w:w="990" w:type="dxa"/>
             <w:vAlign w:val="center"/>
           </w:tcPr>
           <w:p>
@@ -2917,7 +3214,7 @@
         </w:tc>
         <w:tc>
           <w:tcPr>
-            <w:tcW w:w="1620" w:type="dxa"/>
+            <w:tcW w:w="1465" w:type="dxa"/>
             <w:vAlign w:val="center"/>
           </w:tcPr>
           <w:p>
@@ -2955,7 +3252,7 @@
         </w:trPr>
         <w:tc>
           <w:tcPr>
-            <w:tcW w:w="1108" w:type="dxa"/>
+            <w:tcW w:w="1530" w:type="dxa"/>
             <w:vMerge/>
           </w:tcPr>
           <w:p>
@@ -2980,7 +3277,7 @@
         </w:tc>
         <w:tc>
           <w:tcPr>
-            <w:tcW w:w="692" w:type="dxa"/>
+            <w:tcW w:w="720" w:type="dxa"/>
           </w:tcPr>
           <w:p>
             <w:pPr>
@@ -3012,7 +3309,7 @@
         </w:tc>
         <w:tc>
           <w:tcPr>
-            <w:tcW w:w="1298" w:type="dxa"/>
+            <w:tcW w:w="1260" w:type="dxa"/>
             <w:vAlign w:val="center"/>
           </w:tcPr>
           <w:p>
@@ -3045,7 +3342,7 @@
         </w:tc>
         <w:tc>
           <w:tcPr>
-            <w:tcW w:w="1298" w:type="dxa"/>
+            <w:tcW w:w="1170" w:type="dxa"/>
             <w:vAlign w:val="center"/>
           </w:tcPr>
           <w:p>
@@ -3078,7 +3375,7 @@
         </w:tc>
         <w:tc>
           <w:tcPr>
-            <w:tcW w:w="1033" w:type="dxa"/>
+            <w:tcW w:w="990" w:type="dxa"/>
             <w:vAlign w:val="center"/>
           </w:tcPr>
           <w:p>
@@ -3111,7 +3408,7 @@
         </w:tc>
         <w:tc>
           <w:tcPr>
-            <w:tcW w:w="1033" w:type="dxa"/>
+            <w:tcW w:w="990" w:type="dxa"/>
             <w:vAlign w:val="center"/>
           </w:tcPr>
           <w:p>
@@ -3144,7 +3441,7 @@
         </w:tc>
         <w:tc>
           <w:tcPr>
-            <w:tcW w:w="1033" w:type="dxa"/>
+            <w:tcW w:w="990" w:type="dxa"/>
             <w:vAlign w:val="center"/>
           </w:tcPr>
           <w:p>
@@ -3177,7 +3474,7 @@
         </w:tc>
         <w:tc>
           <w:tcPr>
-            <w:tcW w:w="1620" w:type="dxa"/>
+            <w:tcW w:w="1465" w:type="dxa"/>
             <w:vAlign w:val="center"/>
           </w:tcPr>
           <w:p>
@@ -3216,7 +3513,7 @@
         </w:trPr>
         <w:tc>
           <w:tcPr>
-            <w:tcW w:w="1108" w:type="dxa"/>
+            <w:tcW w:w="1530" w:type="dxa"/>
             <w:vMerge/>
           </w:tcPr>
           <w:p>
@@ -3241,7 +3538,7 @@
         </w:tc>
         <w:tc>
           <w:tcPr>
-            <w:tcW w:w="692" w:type="dxa"/>
+            <w:tcW w:w="720" w:type="dxa"/>
           </w:tcPr>
           <w:p>
             <w:pPr>
@@ -3273,7 +3570,7 @@
         </w:tc>
         <w:tc>
           <w:tcPr>
-            <w:tcW w:w="1298" w:type="dxa"/>
+            <w:tcW w:w="1260" w:type="dxa"/>
             <w:vAlign w:val="center"/>
           </w:tcPr>
           <w:p>
@@ -3306,7 +3603,7 @@
         </w:tc>
         <w:tc>
           <w:tcPr>
-            <w:tcW w:w="1298" w:type="dxa"/>
+            <w:tcW w:w="1170" w:type="dxa"/>
             <w:vAlign w:val="center"/>
           </w:tcPr>
           <w:p>
@@ -3339,7 +3636,7 @@
         </w:tc>
         <w:tc>
           <w:tcPr>
-            <w:tcW w:w="1033" w:type="dxa"/>
+            <w:tcW w:w="990" w:type="dxa"/>
             <w:vAlign w:val="center"/>
           </w:tcPr>
           <w:p>
@@ -3372,7 +3669,7 @@
         </w:tc>
         <w:tc>
           <w:tcPr>
-            <w:tcW w:w="1033" w:type="dxa"/>
+            <w:tcW w:w="990" w:type="dxa"/>
             <w:vAlign w:val="center"/>
           </w:tcPr>
           <w:p>
@@ -3405,7 +3702,7 @@
         </w:tc>
         <w:tc>
           <w:tcPr>
-            <w:tcW w:w="1033" w:type="dxa"/>
+            <w:tcW w:w="990" w:type="dxa"/>
             <w:vAlign w:val="center"/>
           </w:tcPr>
           <w:p>
@@ -3438,7 +3735,7 @@
         </w:tc>
         <w:tc>
           <w:tcPr>
-            <w:tcW w:w="1620" w:type="dxa"/>
+            <w:tcW w:w="1465" w:type="dxa"/>
             <w:vAlign w:val="center"/>
           </w:tcPr>
           <w:p>
@@ -3476,7 +3773,7 @@
         </w:trPr>
         <w:tc>
           <w:tcPr>
-            <w:tcW w:w="1108" w:type="dxa"/>
+            <w:tcW w:w="1530" w:type="dxa"/>
             <w:vMerge/>
           </w:tcPr>
           <w:p>
@@ -3501,7 +3798,7 @@
         </w:tc>
         <w:tc>
           <w:tcPr>
-            <w:tcW w:w="692" w:type="dxa"/>
+            <w:tcW w:w="720" w:type="dxa"/>
           </w:tcPr>
           <w:p>
             <w:pPr>
@@ -3533,7 +3830,7 @@
         </w:tc>
         <w:tc>
           <w:tcPr>
-            <w:tcW w:w="1298" w:type="dxa"/>
+            <w:tcW w:w="1260" w:type="dxa"/>
             <w:vAlign w:val="center"/>
           </w:tcPr>
           <w:p>
@@ -3566,7 +3863,7 @@
         </w:tc>
         <w:tc>
           <w:tcPr>
-            <w:tcW w:w="1298" w:type="dxa"/>
+            <w:tcW w:w="1170" w:type="dxa"/>
             <w:vAlign w:val="center"/>
           </w:tcPr>
           <w:p>
@@ -3599,7 +3896,7 @@
         </w:tc>
         <w:tc>
           <w:tcPr>
-            <w:tcW w:w="1033" w:type="dxa"/>
+            <w:tcW w:w="990" w:type="dxa"/>
             <w:vAlign w:val="center"/>
           </w:tcPr>
           <w:p>
@@ -3632,7 +3929,7 @@
         </w:tc>
         <w:tc>
           <w:tcPr>
-            <w:tcW w:w="1033" w:type="dxa"/>
+            <w:tcW w:w="990" w:type="dxa"/>
             <w:vAlign w:val="center"/>
           </w:tcPr>
           <w:p>
@@ -3665,7 +3962,7 @@
         </w:tc>
         <w:tc>
           <w:tcPr>
-            <w:tcW w:w="1033" w:type="dxa"/>
+            <w:tcW w:w="990" w:type="dxa"/>
             <w:vAlign w:val="center"/>
           </w:tcPr>
           <w:p>
@@ -3698,7 +3995,7 @@
         </w:tc>
         <w:tc>
           <w:tcPr>
-            <w:tcW w:w="1620" w:type="dxa"/>
+            <w:tcW w:w="1465" w:type="dxa"/>
             <w:vAlign w:val="center"/>
           </w:tcPr>
           <w:p>
@@ -3737,7 +4034,7 @@
         </w:trPr>
         <w:tc>
           <w:tcPr>
-            <w:tcW w:w="1108" w:type="dxa"/>
+            <w:tcW w:w="1530" w:type="dxa"/>
             <w:vMerge/>
           </w:tcPr>
           <w:p>
@@ -3762,7 +4059,7 @@
         </w:tc>
         <w:tc>
           <w:tcPr>
-            <w:tcW w:w="692" w:type="dxa"/>
+            <w:tcW w:w="720" w:type="dxa"/>
           </w:tcPr>
           <w:p>
             <w:pPr>
@@ -3794,7 +4091,7 @@
         </w:tc>
         <w:tc>
           <w:tcPr>
-            <w:tcW w:w="1298" w:type="dxa"/>
+            <w:tcW w:w="1260" w:type="dxa"/>
             <w:vAlign w:val="center"/>
           </w:tcPr>
           <w:p>
@@ -3827,7 +4124,7 @@
         </w:tc>
         <w:tc>
           <w:tcPr>
-            <w:tcW w:w="1298" w:type="dxa"/>
+            <w:tcW w:w="1170" w:type="dxa"/>
             <w:vAlign w:val="center"/>
           </w:tcPr>
           <w:p>
@@ -3860,7 +4157,7 @@
         </w:tc>
         <w:tc>
           <w:tcPr>
-            <w:tcW w:w="1033" w:type="dxa"/>
+            <w:tcW w:w="990" w:type="dxa"/>
             <w:vAlign w:val="center"/>
           </w:tcPr>
           <w:p>
@@ -3893,7 +4190,7 @@
         </w:tc>
         <w:tc>
           <w:tcPr>
-            <w:tcW w:w="1033" w:type="dxa"/>
+            <w:tcW w:w="990" w:type="dxa"/>
             <w:vAlign w:val="center"/>
           </w:tcPr>
           <w:p>
@@ -3926,7 +4223,7 @@
         </w:tc>
         <w:tc>
           <w:tcPr>
-            <w:tcW w:w="1033" w:type="dxa"/>
+            <w:tcW w:w="990" w:type="dxa"/>
             <w:vAlign w:val="center"/>
           </w:tcPr>
           <w:p>
@@ -3959,7 +4256,7 @@
         </w:tc>
         <w:tc>
           <w:tcPr>
-            <w:tcW w:w="1620" w:type="dxa"/>
+            <w:tcW w:w="1465" w:type="dxa"/>
             <w:vAlign w:val="center"/>
           </w:tcPr>
           <w:p>
@@ -3997,7 +4294,7 @@
         </w:trPr>
         <w:tc>
           <w:tcPr>
-            <w:tcW w:w="1108" w:type="dxa"/>
+            <w:tcW w:w="1530" w:type="dxa"/>
             <w:vMerge/>
           </w:tcPr>
           <w:p>
@@ -4022,7 +4319,7 @@
         </w:tc>
         <w:tc>
           <w:tcPr>
-            <w:tcW w:w="692" w:type="dxa"/>
+            <w:tcW w:w="720" w:type="dxa"/>
           </w:tcPr>
           <w:p>
             <w:pPr>
@@ -4054,7 +4351,7 @@
         </w:tc>
         <w:tc>
           <w:tcPr>
-            <w:tcW w:w="1298" w:type="dxa"/>
+            <w:tcW w:w="1260" w:type="dxa"/>
             <w:vAlign w:val="center"/>
           </w:tcPr>
           <w:p>
@@ -4087,7 +4384,7 @@
         </w:tc>
         <w:tc>
           <w:tcPr>
-            <w:tcW w:w="1298" w:type="dxa"/>
+            <w:tcW w:w="1170" w:type="dxa"/>
             <w:vAlign w:val="center"/>
           </w:tcPr>
           <w:p>
@@ -4120,7 +4417,7 @@
         </w:tc>
         <w:tc>
           <w:tcPr>
-            <w:tcW w:w="1033" w:type="dxa"/>
+            <w:tcW w:w="990" w:type="dxa"/>
             <w:vAlign w:val="center"/>
           </w:tcPr>
           <w:p>
@@ -4153,7 +4450,7 @@
         </w:tc>
         <w:tc>
           <w:tcPr>
-            <w:tcW w:w="1033" w:type="dxa"/>
+            <w:tcW w:w="990" w:type="dxa"/>
             <w:vAlign w:val="center"/>
           </w:tcPr>
           <w:p>
@@ -4186,7 +4483,7 @@
         </w:tc>
         <w:tc>
           <w:tcPr>
-            <w:tcW w:w="1033" w:type="dxa"/>
+            <w:tcW w:w="990" w:type="dxa"/>
             <w:vAlign w:val="center"/>
           </w:tcPr>
           <w:p>
@@ -4219,7 +4516,7 @@
         </w:tc>
         <w:tc>
           <w:tcPr>
-            <w:tcW w:w="1620" w:type="dxa"/>
+            <w:tcW w:w="1465" w:type="dxa"/>
             <w:vAlign w:val="center"/>
           </w:tcPr>
           <w:p>

</xml_diff>

<commit_message>
updated supplemental figure names
</commit_message>
<xml_diff>
--- a/3_Manuscript_Figures/tables/table3.docx
+++ b/3_Manuscript_Figures/tables/table3.docx
@@ -5,7 +5,7 @@
     <w:tbl>
       <w:tblPr>
         <w:tblStyle w:val="PlainTable1"/>
-        <w:tblW w:w="9115" w:type="dxa"/>
+        <w:tblW w:w="9180" w:type="dxa"/>
         <w:tblBorders>
           <w:top w:val="none" w:sz="0" w:space="0" w:color="auto"/>
           <w:left w:val="none" w:sz="0" w:space="0" w:color="auto"/>
@@ -22,8 +22,8 @@
         <w:gridCol w:w="1170"/>
         <w:gridCol w:w="990"/>
         <w:gridCol w:w="990"/>
-        <w:gridCol w:w="990"/>
-        <w:gridCol w:w="1465"/>
+        <w:gridCol w:w="1170"/>
+        <w:gridCol w:w="1350"/>
       </w:tblGrid>
       <w:tr>
         <w:trPr>
@@ -228,7 +228,7 @@
         </w:tc>
         <w:tc>
           <w:tcPr>
-            <w:tcW w:w="990" w:type="dxa"/>
+            <w:tcW w:w="1170" w:type="dxa"/>
           </w:tcPr>
           <w:p>
             <w:pPr>
@@ -262,7 +262,7 @@
         </w:tc>
         <w:tc>
           <w:tcPr>
-            <w:tcW w:w="1465" w:type="dxa"/>
+            <w:tcW w:w="1350" w:type="dxa"/>
           </w:tcPr>
           <w:p>
             <w:pPr>
@@ -543,7 +543,7 @@
         </w:tc>
         <w:tc>
           <w:tcPr>
-            <w:tcW w:w="990" w:type="dxa"/>
+            <w:tcW w:w="1170" w:type="dxa"/>
           </w:tcPr>
           <w:p>
             <w:pPr>
@@ -593,7 +593,7 @@
         </w:tc>
         <w:tc>
           <w:tcPr>
-            <w:tcW w:w="1465" w:type="dxa"/>
+            <w:tcW w:w="1350" w:type="dxa"/>
           </w:tcPr>
           <w:p>
             <w:pPr>
@@ -692,25 +692,7 @@
                 <w:sz w:val="16"/>
                 <w:szCs w:val="16"/>
               </w:rPr>
-              <w:t>4</w:t>
-            </w:r>
-            <w:r>
-              <w:rPr>
-                <w:rFonts w:ascii="Aptos" w:eastAsia="Helvetica" w:hAnsi="Aptos" w:cs="Helvetica"/>
-                <w:color w:val="000000"/>
-                <w:sz w:val="16"/>
-                <w:szCs w:val="16"/>
-              </w:rPr>
-              <w:t xml:space="preserve"> </w:t>
-            </w:r>
-            <w:r>
-              <w:rPr>
-                <w:rFonts w:ascii="Aptos" w:eastAsia="Helvetica" w:hAnsi="Aptos" w:cs="Helvetica"/>
-                <w:color w:val="000000"/>
-                <w:sz w:val="16"/>
-                <w:szCs w:val="16"/>
-              </w:rPr>
-              <w:t>h</w:t>
+              <w:t>4h</w:t>
             </w:r>
           </w:p>
         </w:tc>
@@ -848,7 +830,7 @@
         </w:tc>
         <w:tc>
           <w:tcPr>
-            <w:tcW w:w="990" w:type="dxa"/>
+            <w:tcW w:w="1170" w:type="dxa"/>
             <w:vAlign w:val="center"/>
           </w:tcPr>
           <w:p>
@@ -881,34 +863,52 @@
         </w:tc>
         <w:tc>
           <w:tcPr>
-            <w:tcW w:w="1465" w:type="dxa"/>
-            <w:vAlign w:val="center"/>
-          </w:tcPr>
-          <w:p>
-            <w:pPr>
-              <w:pBdr>
-                <w:top w:val="none" w:sz="0" w:space="0" w:color="000000"/>
-                <w:left w:val="none" w:sz="0" w:space="0" w:color="000000"/>
-                <w:bottom w:val="none" w:sz="0" w:space="0" w:color="000000"/>
-                <w:right w:val="none" w:sz="0" w:space="0" w:color="000000"/>
-              </w:pBdr>
-              <w:spacing w:before="100" w:after="100"/>
-              <w:ind w:left="100" w:right="100"/>
-              <w:rPr>
-                <w:rFonts w:ascii="Aptos" w:eastAsia="Helvetica" w:hAnsi="Aptos" w:cs="Helvetica"/>
-                <w:color w:val="000000"/>
-                <w:sz w:val="16"/>
-                <w:szCs w:val="16"/>
-              </w:rPr>
-            </w:pPr>
-            <w:r>
-              <w:rPr>
-                <w:rFonts w:ascii="Aptos" w:eastAsia="Arial" w:hAnsi="Aptos" w:cs="Arial"/>
-                <w:color w:val="000000"/>
-                <w:sz w:val="16"/>
-                <w:szCs w:val="16"/>
-              </w:rPr>
-              <w:t>965.60 (155.2%)</w:t>
+            <w:tcW w:w="1350" w:type="dxa"/>
+            <w:vAlign w:val="center"/>
+          </w:tcPr>
+          <w:p>
+            <w:pPr>
+              <w:pBdr>
+                <w:top w:val="none" w:sz="0" w:space="0" w:color="000000"/>
+                <w:left w:val="none" w:sz="0" w:space="0" w:color="000000"/>
+                <w:bottom w:val="none" w:sz="0" w:space="0" w:color="000000"/>
+                <w:right w:val="none" w:sz="0" w:space="0" w:color="000000"/>
+              </w:pBdr>
+              <w:spacing w:before="100" w:after="100"/>
+              <w:ind w:left="100" w:right="100"/>
+              <w:rPr>
+                <w:rFonts w:ascii="Aptos" w:eastAsia="Helvetica" w:hAnsi="Aptos" w:cs="Helvetica"/>
+                <w:color w:val="000000"/>
+                <w:sz w:val="16"/>
+                <w:szCs w:val="16"/>
+              </w:rPr>
+            </w:pPr>
+            <w:r>
+              <w:rPr>
+                <w:rFonts w:ascii="Aptos" w:eastAsia="Arial" w:hAnsi="Aptos" w:cs="Arial"/>
+                <w:color w:val="000000"/>
+                <w:sz w:val="16"/>
+                <w:szCs w:val="16"/>
+              </w:rPr>
+              <w:t>96</w:t>
+            </w:r>
+            <w:r>
+              <w:rPr>
+                <w:rFonts w:ascii="Aptos" w:eastAsia="Arial" w:hAnsi="Aptos" w:cs="Arial"/>
+                <w:color w:val="000000"/>
+                <w:sz w:val="16"/>
+                <w:szCs w:val="16"/>
+              </w:rPr>
+              <w:t>6</w:t>
+            </w:r>
+            <w:r>
+              <w:rPr>
+                <w:rFonts w:ascii="Aptos" w:eastAsia="Arial" w:hAnsi="Aptos" w:cs="Arial"/>
+                <w:color w:val="000000"/>
+                <w:sz w:val="16"/>
+                <w:szCs w:val="16"/>
+              </w:rPr>
+              <w:t xml:space="preserve"> (155.2%)</w:t>
             </w:r>
           </w:p>
         </w:tc>
@@ -971,25 +971,7 @@
                 <w:sz w:val="16"/>
                 <w:szCs w:val="16"/>
               </w:rPr>
-              <w:t>8</w:t>
-            </w:r>
-            <w:r>
-              <w:rPr>
-                <w:rFonts w:ascii="Aptos" w:eastAsia="Helvetica" w:hAnsi="Aptos" w:cs="Helvetica"/>
-                <w:color w:val="000000"/>
-                <w:sz w:val="16"/>
-                <w:szCs w:val="16"/>
-              </w:rPr>
-              <w:t xml:space="preserve"> </w:t>
-            </w:r>
-            <w:r>
-              <w:rPr>
-                <w:rFonts w:ascii="Aptos" w:eastAsia="Helvetica" w:hAnsi="Aptos" w:cs="Helvetica"/>
-                <w:color w:val="000000"/>
-                <w:sz w:val="16"/>
-                <w:szCs w:val="16"/>
-              </w:rPr>
-              <w:t>h</w:t>
+              <w:t>8h</w:t>
             </w:r>
           </w:p>
         </w:tc>
@@ -1127,7 +1109,7 @@
         </w:tc>
         <w:tc>
           <w:tcPr>
-            <w:tcW w:w="990" w:type="dxa"/>
+            <w:tcW w:w="1170" w:type="dxa"/>
             <w:vAlign w:val="center"/>
           </w:tcPr>
           <w:p>
@@ -1160,34 +1142,52 @@
         </w:tc>
         <w:tc>
           <w:tcPr>
-            <w:tcW w:w="1465" w:type="dxa"/>
-            <w:vAlign w:val="center"/>
-          </w:tcPr>
-          <w:p>
-            <w:pPr>
-              <w:pBdr>
-                <w:top w:val="none" w:sz="0" w:space="0" w:color="000000"/>
-                <w:left w:val="none" w:sz="0" w:space="0" w:color="000000"/>
-                <w:bottom w:val="none" w:sz="0" w:space="0" w:color="000000"/>
-                <w:right w:val="none" w:sz="0" w:space="0" w:color="000000"/>
-              </w:pBdr>
-              <w:spacing w:before="100" w:after="100"/>
-              <w:ind w:left="100" w:right="100"/>
-              <w:rPr>
-                <w:rFonts w:ascii="Aptos" w:eastAsia="Helvetica" w:hAnsi="Aptos" w:cs="Helvetica"/>
-                <w:color w:val="000000"/>
-                <w:sz w:val="16"/>
-                <w:szCs w:val="16"/>
-              </w:rPr>
-            </w:pPr>
-            <w:r>
-              <w:rPr>
-                <w:rFonts w:ascii="Aptos" w:eastAsia="Arial" w:hAnsi="Aptos" w:cs="Arial"/>
-                <w:color w:val="000000"/>
-                <w:sz w:val="16"/>
-                <w:szCs w:val="16"/>
-              </w:rPr>
-              <w:t>3077.80 (41.4%)</w:t>
+            <w:tcW w:w="1350" w:type="dxa"/>
+            <w:vAlign w:val="center"/>
+          </w:tcPr>
+          <w:p>
+            <w:pPr>
+              <w:pBdr>
+                <w:top w:val="none" w:sz="0" w:space="0" w:color="000000"/>
+                <w:left w:val="none" w:sz="0" w:space="0" w:color="000000"/>
+                <w:bottom w:val="none" w:sz="0" w:space="0" w:color="000000"/>
+                <w:right w:val="none" w:sz="0" w:space="0" w:color="000000"/>
+              </w:pBdr>
+              <w:spacing w:before="100" w:after="100"/>
+              <w:ind w:left="100" w:right="100"/>
+              <w:rPr>
+                <w:rFonts w:ascii="Aptos" w:eastAsia="Helvetica" w:hAnsi="Aptos" w:cs="Helvetica"/>
+                <w:color w:val="000000"/>
+                <w:sz w:val="16"/>
+                <w:szCs w:val="16"/>
+              </w:rPr>
+            </w:pPr>
+            <w:r>
+              <w:rPr>
+                <w:rFonts w:ascii="Aptos" w:eastAsia="Arial" w:hAnsi="Aptos" w:cs="Arial"/>
+                <w:color w:val="000000"/>
+                <w:sz w:val="16"/>
+                <w:szCs w:val="16"/>
+              </w:rPr>
+              <w:t>307</w:t>
+            </w:r>
+            <w:r>
+              <w:rPr>
+                <w:rFonts w:ascii="Aptos" w:eastAsia="Arial" w:hAnsi="Aptos" w:cs="Arial"/>
+                <w:color w:val="000000"/>
+                <w:sz w:val="16"/>
+                <w:szCs w:val="16"/>
+              </w:rPr>
+              <w:t xml:space="preserve">8 </w:t>
+            </w:r>
+            <w:r>
+              <w:rPr>
+                <w:rFonts w:ascii="Aptos" w:eastAsia="Arial" w:hAnsi="Aptos" w:cs="Arial"/>
+                <w:color w:val="000000"/>
+                <w:sz w:val="16"/>
+                <w:szCs w:val="16"/>
+              </w:rPr>
+              <w:t>(41.4%)</w:t>
             </w:r>
           </w:p>
         </w:tc>
@@ -1249,25 +1249,7 @@
                 <w:sz w:val="16"/>
                 <w:szCs w:val="16"/>
               </w:rPr>
-              <w:t>16</w:t>
-            </w:r>
-            <w:r>
-              <w:rPr>
-                <w:rFonts w:ascii="Aptos" w:eastAsia="Helvetica" w:hAnsi="Aptos" w:cs="Helvetica"/>
-                <w:color w:val="000000"/>
-                <w:sz w:val="16"/>
-                <w:szCs w:val="16"/>
-              </w:rPr>
-              <w:t xml:space="preserve"> </w:t>
-            </w:r>
-            <w:r>
-              <w:rPr>
-                <w:rFonts w:ascii="Aptos" w:eastAsia="Helvetica" w:hAnsi="Aptos" w:cs="Helvetica"/>
-                <w:color w:val="000000"/>
-                <w:sz w:val="16"/>
-                <w:szCs w:val="16"/>
-              </w:rPr>
-              <w:t>h</w:t>
+              <w:t>16h</w:t>
             </w:r>
           </w:p>
         </w:tc>
@@ -1405,7 +1387,7 @@
         </w:tc>
         <w:tc>
           <w:tcPr>
-            <w:tcW w:w="990" w:type="dxa"/>
+            <w:tcW w:w="1170" w:type="dxa"/>
             <w:vAlign w:val="center"/>
           </w:tcPr>
           <w:p>
@@ -1438,34 +1420,52 @@
         </w:tc>
         <w:tc>
           <w:tcPr>
-            <w:tcW w:w="1465" w:type="dxa"/>
-            <w:vAlign w:val="center"/>
-          </w:tcPr>
-          <w:p>
-            <w:pPr>
-              <w:pBdr>
-                <w:top w:val="none" w:sz="0" w:space="0" w:color="000000"/>
-                <w:left w:val="none" w:sz="0" w:space="0" w:color="000000"/>
-                <w:bottom w:val="none" w:sz="0" w:space="0" w:color="000000"/>
-                <w:right w:val="none" w:sz="0" w:space="0" w:color="000000"/>
-              </w:pBdr>
-              <w:spacing w:before="100" w:after="100"/>
-              <w:ind w:left="100" w:right="100"/>
-              <w:rPr>
-                <w:rFonts w:ascii="Aptos" w:eastAsia="Helvetica" w:hAnsi="Aptos" w:cs="Helvetica"/>
-                <w:color w:val="000000"/>
-                <w:sz w:val="16"/>
-                <w:szCs w:val="16"/>
-              </w:rPr>
-            </w:pPr>
-            <w:r>
-              <w:rPr>
-                <w:rFonts w:ascii="Aptos" w:eastAsia="Arial" w:hAnsi="Aptos" w:cs="Arial"/>
-                <w:color w:val="000000"/>
-                <w:sz w:val="16"/>
-                <w:szCs w:val="16"/>
-              </w:rPr>
-              <w:t>2894.80 (16.9%)</w:t>
+            <w:tcW w:w="1350" w:type="dxa"/>
+            <w:vAlign w:val="center"/>
+          </w:tcPr>
+          <w:p>
+            <w:pPr>
+              <w:pBdr>
+                <w:top w:val="none" w:sz="0" w:space="0" w:color="000000"/>
+                <w:left w:val="none" w:sz="0" w:space="0" w:color="000000"/>
+                <w:bottom w:val="none" w:sz="0" w:space="0" w:color="000000"/>
+                <w:right w:val="none" w:sz="0" w:space="0" w:color="000000"/>
+              </w:pBdr>
+              <w:spacing w:before="100" w:after="100"/>
+              <w:ind w:left="100" w:right="100"/>
+              <w:rPr>
+                <w:rFonts w:ascii="Aptos" w:eastAsia="Helvetica" w:hAnsi="Aptos" w:cs="Helvetica"/>
+                <w:color w:val="000000"/>
+                <w:sz w:val="16"/>
+                <w:szCs w:val="16"/>
+              </w:rPr>
+            </w:pPr>
+            <w:r>
+              <w:rPr>
+                <w:rFonts w:ascii="Aptos" w:eastAsia="Arial" w:hAnsi="Aptos" w:cs="Arial"/>
+                <w:color w:val="000000"/>
+                <w:sz w:val="16"/>
+                <w:szCs w:val="16"/>
+              </w:rPr>
+              <w:t>289</w:t>
+            </w:r>
+            <w:r>
+              <w:rPr>
+                <w:rFonts w:ascii="Aptos" w:eastAsia="Arial" w:hAnsi="Aptos" w:cs="Arial"/>
+                <w:color w:val="000000"/>
+                <w:sz w:val="16"/>
+                <w:szCs w:val="16"/>
+              </w:rPr>
+              <w:t xml:space="preserve">5 </w:t>
+            </w:r>
+            <w:r>
+              <w:rPr>
+                <w:rFonts w:ascii="Aptos" w:eastAsia="Arial" w:hAnsi="Aptos" w:cs="Arial"/>
+                <w:color w:val="000000"/>
+                <w:sz w:val="16"/>
+                <w:szCs w:val="16"/>
+              </w:rPr>
+              <w:t>(16.9%)</w:t>
             </w:r>
           </w:p>
         </w:tc>
@@ -1528,11 +1528,209 @@
                 <w:sz w:val="16"/>
                 <w:szCs w:val="16"/>
               </w:rPr>
-              <w:t>24</w:t>
-            </w:r>
-            <w:r>
-              <w:rPr>
-                <w:rFonts w:ascii="Aptos" w:eastAsia="Helvetica" w:hAnsi="Aptos" w:cs="Helvetica"/>
+              <w:t>24h</w:t>
+            </w:r>
+          </w:p>
+        </w:tc>
+        <w:tc>
+          <w:tcPr>
+            <w:tcW w:w="1260" w:type="dxa"/>
+            <w:vAlign w:val="center"/>
+          </w:tcPr>
+          <w:p>
+            <w:pPr>
+              <w:pBdr>
+                <w:top w:val="none" w:sz="0" w:space="0" w:color="000000"/>
+                <w:left w:val="none" w:sz="0" w:space="0" w:color="000000"/>
+                <w:bottom w:val="none" w:sz="0" w:space="0" w:color="000000"/>
+                <w:right w:val="none" w:sz="0" w:space="0" w:color="000000"/>
+              </w:pBdr>
+              <w:spacing w:before="100" w:after="100"/>
+              <w:ind w:left="100" w:right="100"/>
+              <w:rPr>
+                <w:rFonts w:ascii="Aptos" w:eastAsia="Arial" w:hAnsi="Aptos" w:cs="Arial"/>
+                <w:color w:val="000000"/>
+                <w:sz w:val="16"/>
+                <w:szCs w:val="16"/>
+              </w:rPr>
+            </w:pPr>
+            <w:r>
+              <w:rPr>
+                <w:rFonts w:ascii="Aptos" w:eastAsia="Arial" w:hAnsi="Aptos" w:cs="Arial"/>
+                <w:color w:val="000000"/>
+                <w:sz w:val="16"/>
+                <w:szCs w:val="16"/>
+              </w:rPr>
+              <w:t>8,226</w:t>
+            </w:r>
+          </w:p>
+        </w:tc>
+        <w:tc>
+          <w:tcPr>
+            <w:tcW w:w="1170" w:type="dxa"/>
+            <w:vAlign w:val="center"/>
+          </w:tcPr>
+          <w:p>
+            <w:pPr>
+              <w:pBdr>
+                <w:top w:val="none" w:sz="0" w:space="0" w:color="000000"/>
+                <w:left w:val="none" w:sz="0" w:space="0" w:color="000000"/>
+                <w:bottom w:val="none" w:sz="0" w:space="0" w:color="000000"/>
+                <w:right w:val="none" w:sz="0" w:space="0" w:color="000000"/>
+              </w:pBdr>
+              <w:spacing w:before="100" w:after="100"/>
+              <w:ind w:left="100" w:right="100"/>
+              <w:rPr>
+                <w:rFonts w:ascii="Aptos" w:eastAsia="Arial" w:hAnsi="Aptos" w:cs="Arial"/>
+                <w:color w:val="000000"/>
+                <w:sz w:val="16"/>
+                <w:szCs w:val="16"/>
+              </w:rPr>
+            </w:pPr>
+            <w:r>
+              <w:rPr>
+                <w:rFonts w:ascii="Aptos" w:eastAsia="Arial" w:hAnsi="Aptos" w:cs="Arial"/>
+                <w:color w:val="000000"/>
+                <w:sz w:val="16"/>
+                <w:szCs w:val="16"/>
+              </w:rPr>
+              <w:t>6,477</w:t>
+            </w:r>
+          </w:p>
+        </w:tc>
+        <w:tc>
+          <w:tcPr>
+            <w:tcW w:w="990" w:type="dxa"/>
+            <w:vAlign w:val="center"/>
+          </w:tcPr>
+          <w:p>
+            <w:pPr>
+              <w:pBdr>
+                <w:top w:val="none" w:sz="0" w:space="0" w:color="000000"/>
+                <w:left w:val="none" w:sz="0" w:space="0" w:color="000000"/>
+                <w:bottom w:val="none" w:sz="0" w:space="0" w:color="000000"/>
+                <w:right w:val="none" w:sz="0" w:space="0" w:color="000000"/>
+              </w:pBdr>
+              <w:spacing w:before="100" w:after="100"/>
+              <w:ind w:left="100" w:right="100"/>
+              <w:rPr>
+                <w:rFonts w:ascii="Aptos" w:eastAsia="Arial" w:hAnsi="Aptos" w:cs="Arial"/>
+                <w:color w:val="000000"/>
+                <w:sz w:val="16"/>
+                <w:szCs w:val="16"/>
+              </w:rPr>
+            </w:pPr>
+            <w:r>
+              <w:rPr>
+                <w:rFonts w:ascii="Aptos" w:eastAsia="Arial" w:hAnsi="Aptos" w:cs="Arial"/>
+                <w:color w:val="000000"/>
+                <w:sz w:val="16"/>
+                <w:szCs w:val="16"/>
+              </w:rPr>
+              <w:t>4,576</w:t>
+            </w:r>
+          </w:p>
+        </w:tc>
+        <w:tc>
+          <w:tcPr>
+            <w:tcW w:w="990" w:type="dxa"/>
+            <w:vAlign w:val="center"/>
+          </w:tcPr>
+          <w:p>
+            <w:pPr>
+              <w:pBdr>
+                <w:top w:val="none" w:sz="0" w:space="0" w:color="000000"/>
+                <w:left w:val="none" w:sz="0" w:space="0" w:color="000000"/>
+                <w:bottom w:val="none" w:sz="0" w:space="0" w:color="000000"/>
+                <w:right w:val="none" w:sz="0" w:space="0" w:color="000000"/>
+              </w:pBdr>
+              <w:spacing w:before="100" w:after="100"/>
+              <w:ind w:left="100" w:right="100"/>
+              <w:rPr>
+                <w:rFonts w:ascii="Aptos" w:eastAsia="Arial" w:hAnsi="Aptos" w:cs="Arial"/>
+                <w:color w:val="000000"/>
+                <w:sz w:val="16"/>
+                <w:szCs w:val="16"/>
+              </w:rPr>
+            </w:pPr>
+            <w:r>
+              <w:rPr>
+                <w:rFonts w:ascii="Aptos" w:eastAsia="Arial" w:hAnsi="Aptos" w:cs="Arial"/>
+                <w:color w:val="000000"/>
+                <w:sz w:val="16"/>
+                <w:szCs w:val="16"/>
+              </w:rPr>
+              <w:t>5,801</w:t>
+            </w:r>
+          </w:p>
+        </w:tc>
+        <w:tc>
+          <w:tcPr>
+            <w:tcW w:w="1170" w:type="dxa"/>
+            <w:vAlign w:val="center"/>
+          </w:tcPr>
+          <w:p>
+            <w:pPr>
+              <w:pBdr>
+                <w:top w:val="none" w:sz="0" w:space="0" w:color="000000"/>
+                <w:left w:val="none" w:sz="0" w:space="0" w:color="000000"/>
+                <w:bottom w:val="none" w:sz="0" w:space="0" w:color="000000"/>
+                <w:right w:val="none" w:sz="0" w:space="0" w:color="000000"/>
+              </w:pBdr>
+              <w:spacing w:before="100" w:after="100"/>
+              <w:ind w:left="100" w:right="100"/>
+              <w:rPr>
+                <w:rFonts w:ascii="Aptos" w:eastAsia="Helvetica" w:hAnsi="Aptos" w:cs="Helvetica"/>
+                <w:color w:val="000000"/>
+                <w:sz w:val="16"/>
+                <w:szCs w:val="16"/>
+              </w:rPr>
+            </w:pPr>
+            <w:r>
+              <w:rPr>
+                <w:rFonts w:ascii="Aptos" w:eastAsia="Arial" w:hAnsi="Aptos" w:cs="Arial"/>
+                <w:color w:val="000000"/>
+                <w:sz w:val="16"/>
+                <w:szCs w:val="16"/>
+              </w:rPr>
+              <w:t>5,298</w:t>
+            </w:r>
+          </w:p>
+        </w:tc>
+        <w:tc>
+          <w:tcPr>
+            <w:tcW w:w="1350" w:type="dxa"/>
+            <w:vAlign w:val="center"/>
+          </w:tcPr>
+          <w:p>
+            <w:pPr>
+              <w:pBdr>
+                <w:top w:val="none" w:sz="0" w:space="0" w:color="000000"/>
+                <w:left w:val="none" w:sz="0" w:space="0" w:color="000000"/>
+                <w:bottom w:val="none" w:sz="0" w:space="0" w:color="000000"/>
+                <w:right w:val="none" w:sz="0" w:space="0" w:color="000000"/>
+              </w:pBdr>
+              <w:spacing w:before="100" w:after="100"/>
+              <w:ind w:left="100" w:right="100"/>
+              <w:rPr>
+                <w:rFonts w:ascii="Aptos" w:eastAsia="Helvetica" w:hAnsi="Aptos" w:cs="Helvetica"/>
+                <w:color w:val="000000"/>
+                <w:sz w:val="16"/>
+                <w:szCs w:val="16"/>
+              </w:rPr>
+            </w:pPr>
+            <w:r>
+              <w:rPr>
+                <w:rFonts w:ascii="Aptos" w:eastAsia="Arial" w:hAnsi="Aptos" w:cs="Arial"/>
+                <w:color w:val="000000"/>
+                <w:sz w:val="16"/>
+                <w:szCs w:val="16"/>
+              </w:rPr>
+              <w:t>6076</w:t>
+            </w:r>
+            <w:r>
+              <w:rPr>
+                <w:rFonts w:ascii="Aptos" w:eastAsia="Arial" w:hAnsi="Aptos" w:cs="Arial"/>
                 <w:color w:val="000000"/>
                 <w:sz w:val="16"/>
                 <w:szCs w:val="16"/>
@@ -1541,210 +1739,12 @@
             </w:r>
             <w:r>
               <w:rPr>
-                <w:rFonts w:ascii="Aptos" w:eastAsia="Helvetica" w:hAnsi="Aptos" w:cs="Helvetica"/>
-                <w:color w:val="000000"/>
-                <w:sz w:val="16"/>
-                <w:szCs w:val="16"/>
-              </w:rPr>
-              <w:t>h</w:t>
-            </w:r>
-          </w:p>
-        </w:tc>
-        <w:tc>
-          <w:tcPr>
-            <w:tcW w:w="1260" w:type="dxa"/>
-            <w:vAlign w:val="center"/>
-          </w:tcPr>
-          <w:p>
-            <w:pPr>
-              <w:pBdr>
-                <w:top w:val="none" w:sz="0" w:space="0" w:color="000000"/>
-                <w:left w:val="none" w:sz="0" w:space="0" w:color="000000"/>
-                <w:bottom w:val="none" w:sz="0" w:space="0" w:color="000000"/>
-                <w:right w:val="none" w:sz="0" w:space="0" w:color="000000"/>
-              </w:pBdr>
-              <w:spacing w:before="100" w:after="100"/>
-              <w:ind w:left="100" w:right="100"/>
-              <w:rPr>
-                <w:rFonts w:ascii="Aptos" w:eastAsia="Arial" w:hAnsi="Aptos" w:cs="Arial"/>
-                <w:color w:val="000000"/>
-                <w:sz w:val="16"/>
-                <w:szCs w:val="16"/>
-              </w:rPr>
-            </w:pPr>
-            <w:r>
-              <w:rPr>
-                <w:rFonts w:ascii="Aptos" w:eastAsia="Arial" w:hAnsi="Aptos" w:cs="Arial"/>
-                <w:color w:val="000000"/>
-                <w:sz w:val="16"/>
-                <w:szCs w:val="16"/>
-              </w:rPr>
-              <w:t>8,226</w:t>
-            </w:r>
-          </w:p>
-        </w:tc>
-        <w:tc>
-          <w:tcPr>
-            <w:tcW w:w="1170" w:type="dxa"/>
-            <w:vAlign w:val="center"/>
-          </w:tcPr>
-          <w:p>
-            <w:pPr>
-              <w:pBdr>
-                <w:top w:val="none" w:sz="0" w:space="0" w:color="000000"/>
-                <w:left w:val="none" w:sz="0" w:space="0" w:color="000000"/>
-                <w:bottom w:val="none" w:sz="0" w:space="0" w:color="000000"/>
-                <w:right w:val="none" w:sz="0" w:space="0" w:color="000000"/>
-              </w:pBdr>
-              <w:spacing w:before="100" w:after="100"/>
-              <w:ind w:left="100" w:right="100"/>
-              <w:rPr>
-                <w:rFonts w:ascii="Aptos" w:eastAsia="Arial" w:hAnsi="Aptos" w:cs="Arial"/>
-                <w:color w:val="000000"/>
-                <w:sz w:val="16"/>
-                <w:szCs w:val="16"/>
-              </w:rPr>
-            </w:pPr>
-            <w:r>
-              <w:rPr>
-                <w:rFonts w:ascii="Aptos" w:eastAsia="Arial" w:hAnsi="Aptos" w:cs="Arial"/>
-                <w:color w:val="000000"/>
-                <w:sz w:val="16"/>
-                <w:szCs w:val="16"/>
-              </w:rPr>
-              <w:t>6,477</w:t>
-            </w:r>
-          </w:p>
-        </w:tc>
-        <w:tc>
-          <w:tcPr>
-            <w:tcW w:w="990" w:type="dxa"/>
-            <w:vAlign w:val="center"/>
-          </w:tcPr>
-          <w:p>
-            <w:pPr>
-              <w:pBdr>
-                <w:top w:val="none" w:sz="0" w:space="0" w:color="000000"/>
-                <w:left w:val="none" w:sz="0" w:space="0" w:color="000000"/>
-                <w:bottom w:val="none" w:sz="0" w:space="0" w:color="000000"/>
-                <w:right w:val="none" w:sz="0" w:space="0" w:color="000000"/>
-              </w:pBdr>
-              <w:spacing w:before="100" w:after="100"/>
-              <w:ind w:left="100" w:right="100"/>
-              <w:rPr>
-                <w:rFonts w:ascii="Aptos" w:eastAsia="Arial" w:hAnsi="Aptos" w:cs="Arial"/>
-                <w:color w:val="000000"/>
-                <w:sz w:val="16"/>
-                <w:szCs w:val="16"/>
-              </w:rPr>
-            </w:pPr>
-            <w:r>
-              <w:rPr>
-                <w:rFonts w:ascii="Aptos" w:eastAsia="Arial" w:hAnsi="Aptos" w:cs="Arial"/>
-                <w:color w:val="000000"/>
-                <w:sz w:val="16"/>
-                <w:szCs w:val="16"/>
-              </w:rPr>
-              <w:t>4,576</w:t>
-            </w:r>
-          </w:p>
-        </w:tc>
-        <w:tc>
-          <w:tcPr>
-            <w:tcW w:w="990" w:type="dxa"/>
-            <w:vAlign w:val="center"/>
-          </w:tcPr>
-          <w:p>
-            <w:pPr>
-              <w:pBdr>
-                <w:top w:val="none" w:sz="0" w:space="0" w:color="000000"/>
-                <w:left w:val="none" w:sz="0" w:space="0" w:color="000000"/>
-                <w:bottom w:val="none" w:sz="0" w:space="0" w:color="000000"/>
-                <w:right w:val="none" w:sz="0" w:space="0" w:color="000000"/>
-              </w:pBdr>
-              <w:spacing w:before="100" w:after="100"/>
-              <w:ind w:left="100" w:right="100"/>
-              <w:rPr>
-                <w:rFonts w:ascii="Aptos" w:eastAsia="Arial" w:hAnsi="Aptos" w:cs="Arial"/>
-                <w:color w:val="000000"/>
-                <w:sz w:val="16"/>
-                <w:szCs w:val="16"/>
-              </w:rPr>
-            </w:pPr>
-            <w:r>
-              <w:rPr>
-                <w:rFonts w:ascii="Aptos" w:eastAsia="Arial" w:hAnsi="Aptos" w:cs="Arial"/>
-                <w:color w:val="000000"/>
-                <w:sz w:val="16"/>
-                <w:szCs w:val="16"/>
-              </w:rPr>
-              <w:t>5,801</w:t>
-            </w:r>
-          </w:p>
-        </w:tc>
-        <w:tc>
-          <w:tcPr>
-            <w:tcW w:w="990" w:type="dxa"/>
-            <w:vAlign w:val="center"/>
-          </w:tcPr>
-          <w:p>
-            <w:pPr>
-              <w:pBdr>
-                <w:top w:val="none" w:sz="0" w:space="0" w:color="000000"/>
-                <w:left w:val="none" w:sz="0" w:space="0" w:color="000000"/>
-                <w:bottom w:val="none" w:sz="0" w:space="0" w:color="000000"/>
-                <w:right w:val="none" w:sz="0" w:space="0" w:color="000000"/>
-              </w:pBdr>
-              <w:spacing w:before="100" w:after="100"/>
-              <w:ind w:left="100" w:right="100"/>
-              <w:rPr>
-                <w:rFonts w:ascii="Aptos" w:eastAsia="Helvetica" w:hAnsi="Aptos" w:cs="Helvetica"/>
-                <w:color w:val="000000"/>
-                <w:sz w:val="16"/>
-                <w:szCs w:val="16"/>
-              </w:rPr>
-            </w:pPr>
-            <w:r>
-              <w:rPr>
-                <w:rFonts w:ascii="Aptos" w:eastAsia="Arial" w:hAnsi="Aptos" w:cs="Arial"/>
-                <w:color w:val="000000"/>
-                <w:sz w:val="16"/>
-                <w:szCs w:val="16"/>
-              </w:rPr>
-              <w:t>5,298</w:t>
-            </w:r>
-          </w:p>
-        </w:tc>
-        <w:tc>
-          <w:tcPr>
-            <w:tcW w:w="1465" w:type="dxa"/>
-            <w:vAlign w:val="center"/>
-          </w:tcPr>
-          <w:p>
-            <w:pPr>
-              <w:pBdr>
-                <w:top w:val="none" w:sz="0" w:space="0" w:color="000000"/>
-                <w:left w:val="none" w:sz="0" w:space="0" w:color="000000"/>
-                <w:bottom w:val="none" w:sz="0" w:space="0" w:color="000000"/>
-                <w:right w:val="none" w:sz="0" w:space="0" w:color="000000"/>
-              </w:pBdr>
-              <w:spacing w:before="100" w:after="100"/>
-              <w:ind w:left="100" w:right="100"/>
-              <w:rPr>
-                <w:rFonts w:ascii="Aptos" w:eastAsia="Helvetica" w:hAnsi="Aptos" w:cs="Helvetica"/>
-                <w:color w:val="000000"/>
-                <w:sz w:val="16"/>
-                <w:szCs w:val="16"/>
-              </w:rPr>
-            </w:pPr>
-            <w:r>
-              <w:rPr>
-                <w:rFonts w:ascii="Aptos" w:eastAsia="Arial" w:hAnsi="Aptos" w:cs="Arial"/>
-                <w:color w:val="000000"/>
-                <w:sz w:val="16"/>
-                <w:szCs w:val="16"/>
-              </w:rPr>
-              <w:t>6075.60 (22.9%)</w:t>
+                <w:rFonts w:ascii="Aptos" w:eastAsia="Arial" w:hAnsi="Aptos" w:cs="Arial"/>
+                <w:color w:val="000000"/>
+                <w:sz w:val="16"/>
+                <w:szCs w:val="16"/>
+              </w:rPr>
+              <w:t>(22.9%)</w:t>
             </w:r>
           </w:p>
         </w:tc>
@@ -1806,25 +1806,7 @@
                 <w:sz w:val="16"/>
                 <w:szCs w:val="16"/>
               </w:rPr>
-              <w:t>48</w:t>
-            </w:r>
-            <w:r>
-              <w:rPr>
-                <w:rFonts w:ascii="Aptos" w:eastAsia="Helvetica" w:hAnsi="Aptos" w:cs="Helvetica"/>
-                <w:color w:val="000000"/>
-                <w:sz w:val="16"/>
-                <w:szCs w:val="16"/>
-              </w:rPr>
-              <w:t xml:space="preserve"> </w:t>
-            </w:r>
-            <w:r>
-              <w:rPr>
-                <w:rFonts w:ascii="Aptos" w:eastAsia="Helvetica" w:hAnsi="Aptos" w:cs="Helvetica"/>
-                <w:color w:val="000000"/>
-                <w:sz w:val="16"/>
-                <w:szCs w:val="16"/>
-              </w:rPr>
-              <w:t>h</w:t>
+              <w:t>48h</w:t>
             </w:r>
           </w:p>
         </w:tc>
@@ -1962,7 +1944,7 @@
         </w:tc>
         <w:tc>
           <w:tcPr>
-            <w:tcW w:w="990" w:type="dxa"/>
+            <w:tcW w:w="1170" w:type="dxa"/>
             <w:vAlign w:val="center"/>
           </w:tcPr>
           <w:p>
@@ -1995,34 +1977,34 @@
         </w:tc>
         <w:tc>
           <w:tcPr>
-            <w:tcW w:w="1465" w:type="dxa"/>
-            <w:vAlign w:val="center"/>
-          </w:tcPr>
-          <w:p>
-            <w:pPr>
-              <w:pBdr>
-                <w:top w:val="none" w:sz="0" w:space="0" w:color="000000"/>
-                <w:left w:val="none" w:sz="0" w:space="0" w:color="000000"/>
-                <w:bottom w:val="none" w:sz="0" w:space="0" w:color="000000"/>
-                <w:right w:val="none" w:sz="0" w:space="0" w:color="000000"/>
-              </w:pBdr>
-              <w:spacing w:before="100" w:after="100"/>
-              <w:ind w:left="100" w:right="100"/>
-              <w:rPr>
-                <w:rFonts w:ascii="Aptos" w:eastAsia="Helvetica" w:hAnsi="Aptos" w:cs="Helvetica"/>
-                <w:color w:val="000000"/>
-                <w:sz w:val="16"/>
-                <w:szCs w:val="16"/>
-              </w:rPr>
-            </w:pPr>
-            <w:r>
-              <w:rPr>
-                <w:rFonts w:ascii="Aptos" w:eastAsia="Arial" w:hAnsi="Aptos" w:cs="Arial"/>
-                <w:color w:val="000000"/>
-                <w:sz w:val="16"/>
-                <w:szCs w:val="16"/>
-              </w:rPr>
-              <w:t>5847.80 (15.8%)</w:t>
+            <w:tcW w:w="1350" w:type="dxa"/>
+            <w:vAlign w:val="center"/>
+          </w:tcPr>
+          <w:p>
+            <w:pPr>
+              <w:pBdr>
+                <w:top w:val="none" w:sz="0" w:space="0" w:color="000000"/>
+                <w:left w:val="none" w:sz="0" w:space="0" w:color="000000"/>
+                <w:bottom w:val="none" w:sz="0" w:space="0" w:color="000000"/>
+                <w:right w:val="none" w:sz="0" w:space="0" w:color="000000"/>
+              </w:pBdr>
+              <w:spacing w:before="100" w:after="100"/>
+              <w:ind w:left="100" w:right="100"/>
+              <w:rPr>
+                <w:rFonts w:ascii="Aptos" w:eastAsia="Helvetica" w:hAnsi="Aptos" w:cs="Helvetica"/>
+                <w:color w:val="000000"/>
+                <w:sz w:val="16"/>
+                <w:szCs w:val="16"/>
+              </w:rPr>
+            </w:pPr>
+            <w:r>
+              <w:rPr>
+                <w:rFonts w:ascii="Aptos" w:eastAsia="Arial" w:hAnsi="Aptos" w:cs="Arial"/>
+                <w:color w:val="000000"/>
+                <w:sz w:val="16"/>
+                <w:szCs w:val="16"/>
+              </w:rPr>
+              <w:t>5848 (15.8%)</w:t>
             </w:r>
           </w:p>
         </w:tc>
@@ -2085,11 +2067,209 @@
                 <w:sz w:val="16"/>
                 <w:szCs w:val="16"/>
               </w:rPr>
-              <w:t>72</w:t>
-            </w:r>
-            <w:r>
-              <w:rPr>
-                <w:rFonts w:ascii="Aptos" w:eastAsia="Helvetica" w:hAnsi="Aptos" w:cs="Helvetica"/>
+              <w:t>72h</w:t>
+            </w:r>
+          </w:p>
+        </w:tc>
+        <w:tc>
+          <w:tcPr>
+            <w:tcW w:w="1260" w:type="dxa"/>
+            <w:vAlign w:val="center"/>
+          </w:tcPr>
+          <w:p>
+            <w:pPr>
+              <w:pBdr>
+                <w:top w:val="none" w:sz="0" w:space="0" w:color="000000"/>
+                <w:left w:val="none" w:sz="0" w:space="0" w:color="000000"/>
+                <w:bottom w:val="none" w:sz="0" w:space="0" w:color="000000"/>
+                <w:right w:val="none" w:sz="0" w:space="0" w:color="000000"/>
+              </w:pBdr>
+              <w:spacing w:before="100" w:after="100"/>
+              <w:ind w:left="100" w:right="100"/>
+              <w:rPr>
+                <w:rFonts w:ascii="Aptos" w:eastAsia="Arial" w:hAnsi="Aptos" w:cs="Arial"/>
+                <w:color w:val="000000"/>
+                <w:sz w:val="16"/>
+                <w:szCs w:val="16"/>
+              </w:rPr>
+            </w:pPr>
+            <w:r>
+              <w:rPr>
+                <w:rFonts w:ascii="Aptos" w:eastAsia="Arial" w:hAnsi="Aptos" w:cs="Arial"/>
+                <w:color w:val="000000"/>
+                <w:sz w:val="16"/>
+                <w:szCs w:val="16"/>
+              </w:rPr>
+              <w:t>8,895</w:t>
+            </w:r>
+          </w:p>
+        </w:tc>
+        <w:tc>
+          <w:tcPr>
+            <w:tcW w:w="1170" w:type="dxa"/>
+            <w:vAlign w:val="center"/>
+          </w:tcPr>
+          <w:p>
+            <w:pPr>
+              <w:pBdr>
+                <w:top w:val="none" w:sz="0" w:space="0" w:color="000000"/>
+                <w:left w:val="none" w:sz="0" w:space="0" w:color="000000"/>
+                <w:bottom w:val="none" w:sz="0" w:space="0" w:color="000000"/>
+                <w:right w:val="none" w:sz="0" w:space="0" w:color="000000"/>
+              </w:pBdr>
+              <w:spacing w:before="100" w:after="100"/>
+              <w:ind w:left="100" w:right="100"/>
+              <w:rPr>
+                <w:rFonts w:ascii="Aptos" w:eastAsia="Arial" w:hAnsi="Aptos" w:cs="Arial"/>
+                <w:color w:val="000000"/>
+                <w:sz w:val="16"/>
+                <w:szCs w:val="16"/>
+              </w:rPr>
+            </w:pPr>
+            <w:r>
+              <w:rPr>
+                <w:rFonts w:ascii="Aptos" w:eastAsia="Arial" w:hAnsi="Aptos" w:cs="Arial"/>
+                <w:color w:val="000000"/>
+                <w:sz w:val="16"/>
+                <w:szCs w:val="16"/>
+              </w:rPr>
+              <w:t>6,401</w:t>
+            </w:r>
+          </w:p>
+        </w:tc>
+        <w:tc>
+          <w:tcPr>
+            <w:tcW w:w="990" w:type="dxa"/>
+            <w:vAlign w:val="center"/>
+          </w:tcPr>
+          <w:p>
+            <w:pPr>
+              <w:pBdr>
+                <w:top w:val="none" w:sz="0" w:space="0" w:color="000000"/>
+                <w:left w:val="none" w:sz="0" w:space="0" w:color="000000"/>
+                <w:bottom w:val="none" w:sz="0" w:space="0" w:color="000000"/>
+                <w:right w:val="none" w:sz="0" w:space="0" w:color="000000"/>
+              </w:pBdr>
+              <w:spacing w:before="100" w:after="100"/>
+              <w:ind w:left="100" w:right="100"/>
+              <w:rPr>
+                <w:rFonts w:ascii="Aptos" w:eastAsia="Arial" w:hAnsi="Aptos" w:cs="Arial"/>
+                <w:color w:val="000000"/>
+                <w:sz w:val="16"/>
+                <w:szCs w:val="16"/>
+              </w:rPr>
+            </w:pPr>
+            <w:r>
+              <w:rPr>
+                <w:rFonts w:ascii="Aptos" w:eastAsia="Arial" w:hAnsi="Aptos" w:cs="Arial"/>
+                <w:color w:val="000000"/>
+                <w:sz w:val="16"/>
+                <w:szCs w:val="16"/>
+              </w:rPr>
+              <w:t>5,245</w:t>
+            </w:r>
+          </w:p>
+        </w:tc>
+        <w:tc>
+          <w:tcPr>
+            <w:tcW w:w="990" w:type="dxa"/>
+            <w:vAlign w:val="center"/>
+          </w:tcPr>
+          <w:p>
+            <w:pPr>
+              <w:pBdr>
+                <w:top w:val="none" w:sz="0" w:space="0" w:color="000000"/>
+                <w:left w:val="none" w:sz="0" w:space="0" w:color="000000"/>
+                <w:bottom w:val="none" w:sz="0" w:space="0" w:color="000000"/>
+                <w:right w:val="none" w:sz="0" w:space="0" w:color="000000"/>
+              </w:pBdr>
+              <w:spacing w:before="100" w:after="100"/>
+              <w:ind w:left="100" w:right="100"/>
+              <w:rPr>
+                <w:rFonts w:ascii="Aptos" w:eastAsia="Arial" w:hAnsi="Aptos" w:cs="Arial"/>
+                <w:color w:val="000000"/>
+                <w:sz w:val="16"/>
+                <w:szCs w:val="16"/>
+              </w:rPr>
+            </w:pPr>
+            <w:r>
+              <w:rPr>
+                <w:rFonts w:ascii="Aptos" w:eastAsia="Arial" w:hAnsi="Aptos" w:cs="Arial"/>
+                <w:color w:val="000000"/>
+                <w:sz w:val="16"/>
+                <w:szCs w:val="16"/>
+              </w:rPr>
+              <w:t>6,562</w:t>
+            </w:r>
+          </w:p>
+        </w:tc>
+        <w:tc>
+          <w:tcPr>
+            <w:tcW w:w="1170" w:type="dxa"/>
+            <w:vAlign w:val="center"/>
+          </w:tcPr>
+          <w:p>
+            <w:pPr>
+              <w:pBdr>
+                <w:top w:val="none" w:sz="0" w:space="0" w:color="000000"/>
+                <w:left w:val="none" w:sz="0" w:space="0" w:color="000000"/>
+                <w:bottom w:val="none" w:sz="0" w:space="0" w:color="000000"/>
+                <w:right w:val="none" w:sz="0" w:space="0" w:color="000000"/>
+              </w:pBdr>
+              <w:spacing w:before="100" w:after="100"/>
+              <w:ind w:left="100" w:right="100"/>
+              <w:rPr>
+                <w:rFonts w:ascii="Aptos" w:eastAsia="Helvetica" w:hAnsi="Aptos" w:cs="Helvetica"/>
+                <w:color w:val="000000"/>
+                <w:sz w:val="16"/>
+                <w:szCs w:val="16"/>
+              </w:rPr>
+            </w:pPr>
+            <w:r>
+              <w:rPr>
+                <w:rFonts w:ascii="Aptos" w:eastAsia="Arial" w:hAnsi="Aptos" w:cs="Arial"/>
+                <w:color w:val="000000"/>
+                <w:sz w:val="16"/>
+                <w:szCs w:val="16"/>
+              </w:rPr>
+              <w:t>6,028</w:t>
+            </w:r>
+          </w:p>
+        </w:tc>
+        <w:tc>
+          <w:tcPr>
+            <w:tcW w:w="1350" w:type="dxa"/>
+            <w:vAlign w:val="center"/>
+          </w:tcPr>
+          <w:p>
+            <w:pPr>
+              <w:pBdr>
+                <w:top w:val="none" w:sz="0" w:space="0" w:color="000000"/>
+                <w:left w:val="none" w:sz="0" w:space="0" w:color="000000"/>
+                <w:bottom w:val="none" w:sz="0" w:space="0" w:color="000000"/>
+                <w:right w:val="none" w:sz="0" w:space="0" w:color="000000"/>
+              </w:pBdr>
+              <w:spacing w:before="100" w:after="100"/>
+              <w:ind w:left="100" w:right="100"/>
+              <w:rPr>
+                <w:rFonts w:ascii="Aptos" w:eastAsia="Helvetica" w:hAnsi="Aptos" w:cs="Helvetica"/>
+                <w:color w:val="000000"/>
+                <w:sz w:val="16"/>
+                <w:szCs w:val="16"/>
+              </w:rPr>
+            </w:pPr>
+            <w:r>
+              <w:rPr>
+                <w:rFonts w:ascii="Aptos" w:eastAsia="Arial" w:hAnsi="Aptos" w:cs="Arial"/>
+                <w:color w:val="000000"/>
+                <w:sz w:val="16"/>
+                <w:szCs w:val="16"/>
+              </w:rPr>
+              <w:t>6626</w:t>
+            </w:r>
+            <w:r>
+              <w:rPr>
+                <w:rFonts w:ascii="Aptos" w:eastAsia="Arial" w:hAnsi="Aptos" w:cs="Arial"/>
                 <w:color w:val="000000"/>
                 <w:sz w:val="16"/>
                 <w:szCs w:val="16"/>
@@ -2098,210 +2278,12 @@
             </w:r>
             <w:r>
               <w:rPr>
-                <w:rFonts w:ascii="Aptos" w:eastAsia="Helvetica" w:hAnsi="Aptos" w:cs="Helvetica"/>
-                <w:color w:val="000000"/>
-                <w:sz w:val="16"/>
-                <w:szCs w:val="16"/>
-              </w:rPr>
-              <w:t>h</w:t>
-            </w:r>
-          </w:p>
-        </w:tc>
-        <w:tc>
-          <w:tcPr>
-            <w:tcW w:w="1260" w:type="dxa"/>
-            <w:vAlign w:val="center"/>
-          </w:tcPr>
-          <w:p>
-            <w:pPr>
-              <w:pBdr>
-                <w:top w:val="none" w:sz="0" w:space="0" w:color="000000"/>
-                <w:left w:val="none" w:sz="0" w:space="0" w:color="000000"/>
-                <w:bottom w:val="none" w:sz="0" w:space="0" w:color="000000"/>
-                <w:right w:val="none" w:sz="0" w:space="0" w:color="000000"/>
-              </w:pBdr>
-              <w:spacing w:before="100" w:after="100"/>
-              <w:ind w:left="100" w:right="100"/>
-              <w:rPr>
-                <w:rFonts w:ascii="Aptos" w:eastAsia="Arial" w:hAnsi="Aptos" w:cs="Arial"/>
-                <w:color w:val="000000"/>
-                <w:sz w:val="16"/>
-                <w:szCs w:val="16"/>
-              </w:rPr>
-            </w:pPr>
-            <w:r>
-              <w:rPr>
-                <w:rFonts w:ascii="Aptos" w:eastAsia="Arial" w:hAnsi="Aptos" w:cs="Arial"/>
-                <w:color w:val="000000"/>
-                <w:sz w:val="16"/>
-                <w:szCs w:val="16"/>
-              </w:rPr>
-              <w:t>8,895</w:t>
-            </w:r>
-          </w:p>
-        </w:tc>
-        <w:tc>
-          <w:tcPr>
-            <w:tcW w:w="1170" w:type="dxa"/>
-            <w:vAlign w:val="center"/>
-          </w:tcPr>
-          <w:p>
-            <w:pPr>
-              <w:pBdr>
-                <w:top w:val="none" w:sz="0" w:space="0" w:color="000000"/>
-                <w:left w:val="none" w:sz="0" w:space="0" w:color="000000"/>
-                <w:bottom w:val="none" w:sz="0" w:space="0" w:color="000000"/>
-                <w:right w:val="none" w:sz="0" w:space="0" w:color="000000"/>
-              </w:pBdr>
-              <w:spacing w:before="100" w:after="100"/>
-              <w:ind w:left="100" w:right="100"/>
-              <w:rPr>
-                <w:rFonts w:ascii="Aptos" w:eastAsia="Arial" w:hAnsi="Aptos" w:cs="Arial"/>
-                <w:color w:val="000000"/>
-                <w:sz w:val="16"/>
-                <w:szCs w:val="16"/>
-              </w:rPr>
-            </w:pPr>
-            <w:r>
-              <w:rPr>
-                <w:rFonts w:ascii="Aptos" w:eastAsia="Arial" w:hAnsi="Aptos" w:cs="Arial"/>
-                <w:color w:val="000000"/>
-                <w:sz w:val="16"/>
-                <w:szCs w:val="16"/>
-              </w:rPr>
-              <w:t>6,401</w:t>
-            </w:r>
-          </w:p>
-        </w:tc>
-        <w:tc>
-          <w:tcPr>
-            <w:tcW w:w="990" w:type="dxa"/>
-            <w:vAlign w:val="center"/>
-          </w:tcPr>
-          <w:p>
-            <w:pPr>
-              <w:pBdr>
-                <w:top w:val="none" w:sz="0" w:space="0" w:color="000000"/>
-                <w:left w:val="none" w:sz="0" w:space="0" w:color="000000"/>
-                <w:bottom w:val="none" w:sz="0" w:space="0" w:color="000000"/>
-                <w:right w:val="none" w:sz="0" w:space="0" w:color="000000"/>
-              </w:pBdr>
-              <w:spacing w:before="100" w:after="100"/>
-              <w:ind w:left="100" w:right="100"/>
-              <w:rPr>
-                <w:rFonts w:ascii="Aptos" w:eastAsia="Arial" w:hAnsi="Aptos" w:cs="Arial"/>
-                <w:color w:val="000000"/>
-                <w:sz w:val="16"/>
-                <w:szCs w:val="16"/>
-              </w:rPr>
-            </w:pPr>
-            <w:r>
-              <w:rPr>
-                <w:rFonts w:ascii="Aptos" w:eastAsia="Arial" w:hAnsi="Aptos" w:cs="Arial"/>
-                <w:color w:val="000000"/>
-                <w:sz w:val="16"/>
-                <w:szCs w:val="16"/>
-              </w:rPr>
-              <w:t>5,245</w:t>
-            </w:r>
-          </w:p>
-        </w:tc>
-        <w:tc>
-          <w:tcPr>
-            <w:tcW w:w="990" w:type="dxa"/>
-            <w:vAlign w:val="center"/>
-          </w:tcPr>
-          <w:p>
-            <w:pPr>
-              <w:pBdr>
-                <w:top w:val="none" w:sz="0" w:space="0" w:color="000000"/>
-                <w:left w:val="none" w:sz="0" w:space="0" w:color="000000"/>
-                <w:bottom w:val="none" w:sz="0" w:space="0" w:color="000000"/>
-                <w:right w:val="none" w:sz="0" w:space="0" w:color="000000"/>
-              </w:pBdr>
-              <w:spacing w:before="100" w:after="100"/>
-              <w:ind w:left="100" w:right="100"/>
-              <w:rPr>
-                <w:rFonts w:ascii="Aptos" w:eastAsia="Arial" w:hAnsi="Aptos" w:cs="Arial"/>
-                <w:color w:val="000000"/>
-                <w:sz w:val="16"/>
-                <w:szCs w:val="16"/>
-              </w:rPr>
-            </w:pPr>
-            <w:r>
-              <w:rPr>
-                <w:rFonts w:ascii="Aptos" w:eastAsia="Arial" w:hAnsi="Aptos" w:cs="Arial"/>
-                <w:color w:val="000000"/>
-                <w:sz w:val="16"/>
-                <w:szCs w:val="16"/>
-              </w:rPr>
-              <w:t>6,562</w:t>
-            </w:r>
-          </w:p>
-        </w:tc>
-        <w:tc>
-          <w:tcPr>
-            <w:tcW w:w="990" w:type="dxa"/>
-            <w:vAlign w:val="center"/>
-          </w:tcPr>
-          <w:p>
-            <w:pPr>
-              <w:pBdr>
-                <w:top w:val="none" w:sz="0" w:space="0" w:color="000000"/>
-                <w:left w:val="none" w:sz="0" w:space="0" w:color="000000"/>
-                <w:bottom w:val="none" w:sz="0" w:space="0" w:color="000000"/>
-                <w:right w:val="none" w:sz="0" w:space="0" w:color="000000"/>
-              </w:pBdr>
-              <w:spacing w:before="100" w:after="100"/>
-              <w:ind w:left="100" w:right="100"/>
-              <w:rPr>
-                <w:rFonts w:ascii="Aptos" w:eastAsia="Helvetica" w:hAnsi="Aptos" w:cs="Helvetica"/>
-                <w:color w:val="000000"/>
-                <w:sz w:val="16"/>
-                <w:szCs w:val="16"/>
-              </w:rPr>
-            </w:pPr>
-            <w:r>
-              <w:rPr>
-                <w:rFonts w:ascii="Aptos" w:eastAsia="Arial" w:hAnsi="Aptos" w:cs="Arial"/>
-                <w:color w:val="000000"/>
-                <w:sz w:val="16"/>
-                <w:szCs w:val="16"/>
-              </w:rPr>
-              <w:t>6,028</w:t>
-            </w:r>
-          </w:p>
-        </w:tc>
-        <w:tc>
-          <w:tcPr>
-            <w:tcW w:w="1465" w:type="dxa"/>
-            <w:vAlign w:val="center"/>
-          </w:tcPr>
-          <w:p>
-            <w:pPr>
-              <w:pBdr>
-                <w:top w:val="none" w:sz="0" w:space="0" w:color="000000"/>
-                <w:left w:val="none" w:sz="0" w:space="0" w:color="000000"/>
-                <w:bottom w:val="none" w:sz="0" w:space="0" w:color="000000"/>
-                <w:right w:val="none" w:sz="0" w:space="0" w:color="000000"/>
-              </w:pBdr>
-              <w:spacing w:before="100" w:after="100"/>
-              <w:ind w:left="100" w:right="100"/>
-              <w:rPr>
-                <w:rFonts w:ascii="Aptos" w:eastAsia="Helvetica" w:hAnsi="Aptos" w:cs="Helvetica"/>
-                <w:color w:val="000000"/>
-                <w:sz w:val="16"/>
-                <w:szCs w:val="16"/>
-              </w:rPr>
-            </w:pPr>
-            <w:r>
-              <w:rPr>
-                <w:rFonts w:ascii="Aptos" w:eastAsia="Arial" w:hAnsi="Aptos" w:cs="Arial"/>
-                <w:color w:val="000000"/>
-                <w:sz w:val="16"/>
-                <w:szCs w:val="16"/>
-              </w:rPr>
-              <w:t>6626.20 (20.6%)</w:t>
+                <w:rFonts w:ascii="Aptos" w:eastAsia="Arial" w:hAnsi="Aptos" w:cs="Arial"/>
+                <w:color w:val="000000"/>
+                <w:sz w:val="16"/>
+                <w:szCs w:val="16"/>
+              </w:rPr>
+              <w:t>(20.6%)</w:t>
             </w:r>
           </w:p>
         </w:tc>
@@ -2554,7 +2536,38 @@
                 <w:sz w:val="16"/>
                 <w:szCs w:val="16"/>
               </w:rPr>
-              <w:t> 20; (4)  Rsquared </w:t>
+              <w:t> 20; (4</w:t>
+            </w:r>
+            <w:proofErr w:type="gramStart"/>
+            <w:r>
+              <w:rPr>
+                <w:rFonts w:ascii="Aptos" w:eastAsia="Times New Roman" w:hAnsi="Aptos" w:cs="Segoe UI"/>
+                <w:color w:val="000000"/>
+                <w:sz w:val="16"/>
+                <w:szCs w:val="16"/>
+              </w:rPr>
+              <w:t>)  </w:t>
+            </w:r>
+            <w:proofErr w:type="spellStart"/>
+            <w:r>
+              <w:rPr>
+                <w:rFonts w:ascii="Aptos" w:eastAsia="Times New Roman" w:hAnsi="Aptos" w:cs="Segoe UI"/>
+                <w:color w:val="000000"/>
+                <w:sz w:val="16"/>
+                <w:szCs w:val="16"/>
+              </w:rPr>
+              <w:t>Rsquared</w:t>
+            </w:r>
+            <w:proofErr w:type="spellEnd"/>
+            <w:proofErr w:type="gramEnd"/>
+            <w:r>
+              <w:rPr>
+                <w:rFonts w:ascii="Aptos" w:eastAsia="Times New Roman" w:hAnsi="Aptos" w:cs="Segoe UI"/>
+                <w:color w:val="000000"/>
+                <w:sz w:val="16"/>
+                <w:szCs w:val="16"/>
+              </w:rPr>
+              <w:t> </w:t>
             </w:r>
             <w:r>
               <w:rPr>
@@ -2903,7 +2916,7 @@
         </w:tc>
         <w:tc>
           <w:tcPr>
-            <w:tcW w:w="990" w:type="dxa"/>
+            <w:tcW w:w="1170" w:type="dxa"/>
           </w:tcPr>
           <w:p>
             <w:pPr>
@@ -2953,7 +2966,7 @@
         </w:tc>
         <w:tc>
           <w:tcPr>
-            <w:tcW w:w="1465" w:type="dxa"/>
+            <w:tcW w:w="1350" w:type="dxa"/>
           </w:tcPr>
           <w:p>
             <w:pPr>
@@ -3181,7 +3194,7 @@
         </w:tc>
         <w:tc>
           <w:tcPr>
-            <w:tcW w:w="990" w:type="dxa"/>
+            <w:tcW w:w="1170" w:type="dxa"/>
             <w:vAlign w:val="center"/>
           </w:tcPr>
           <w:p>
@@ -3214,34 +3227,52 @@
         </w:tc>
         <w:tc>
           <w:tcPr>
-            <w:tcW w:w="1465" w:type="dxa"/>
-            <w:vAlign w:val="center"/>
-          </w:tcPr>
-          <w:p>
-            <w:pPr>
-              <w:pBdr>
-                <w:top w:val="none" w:sz="0" w:space="0" w:color="000000"/>
-                <w:left w:val="none" w:sz="0" w:space="0" w:color="000000"/>
-                <w:bottom w:val="none" w:sz="0" w:space="0" w:color="000000"/>
-                <w:right w:val="none" w:sz="0" w:space="0" w:color="000000"/>
-              </w:pBdr>
-              <w:spacing w:before="100" w:after="100"/>
-              <w:ind w:left="100" w:right="100"/>
-              <w:rPr>
-                <w:rFonts w:ascii="Aptos" w:eastAsia="Helvetica" w:hAnsi="Aptos" w:cs="Helvetica"/>
-                <w:color w:val="000000"/>
-                <w:sz w:val="16"/>
-                <w:szCs w:val="16"/>
-              </w:rPr>
-            </w:pPr>
-            <w:r>
-              <w:rPr>
-                <w:rFonts w:ascii="Aptos" w:eastAsia="Arial" w:hAnsi="Aptos" w:cs="Arial"/>
-                <w:color w:val="000000"/>
-                <w:sz w:val="16"/>
-                <w:szCs w:val="16"/>
-              </w:rPr>
-              <w:t>490.80 (173.1%)</w:t>
+            <w:tcW w:w="1350" w:type="dxa"/>
+            <w:vAlign w:val="center"/>
+          </w:tcPr>
+          <w:p>
+            <w:pPr>
+              <w:pBdr>
+                <w:top w:val="none" w:sz="0" w:space="0" w:color="000000"/>
+                <w:left w:val="none" w:sz="0" w:space="0" w:color="000000"/>
+                <w:bottom w:val="none" w:sz="0" w:space="0" w:color="000000"/>
+                <w:right w:val="none" w:sz="0" w:space="0" w:color="000000"/>
+              </w:pBdr>
+              <w:spacing w:before="100" w:after="100"/>
+              <w:ind w:left="100" w:right="100"/>
+              <w:rPr>
+                <w:rFonts w:ascii="Aptos" w:eastAsia="Helvetica" w:hAnsi="Aptos" w:cs="Helvetica"/>
+                <w:color w:val="000000"/>
+                <w:sz w:val="16"/>
+                <w:szCs w:val="16"/>
+              </w:rPr>
+            </w:pPr>
+            <w:r>
+              <w:rPr>
+                <w:rFonts w:ascii="Aptos" w:eastAsia="Arial" w:hAnsi="Aptos" w:cs="Arial"/>
+                <w:color w:val="000000"/>
+                <w:sz w:val="16"/>
+                <w:szCs w:val="16"/>
+              </w:rPr>
+              <w:t>49</w:t>
+            </w:r>
+            <w:r>
+              <w:rPr>
+                <w:rFonts w:ascii="Aptos" w:eastAsia="Arial" w:hAnsi="Aptos" w:cs="Arial"/>
+                <w:color w:val="000000"/>
+                <w:sz w:val="16"/>
+                <w:szCs w:val="16"/>
+              </w:rPr>
+              <w:t xml:space="preserve">1 </w:t>
+            </w:r>
+            <w:r>
+              <w:rPr>
+                <w:rFonts w:ascii="Aptos" w:eastAsia="Arial" w:hAnsi="Aptos" w:cs="Arial"/>
+                <w:color w:val="000000"/>
+                <w:sz w:val="16"/>
+                <w:szCs w:val="16"/>
+              </w:rPr>
+              <w:t>(173.1%)</w:t>
             </w:r>
           </w:p>
         </w:tc>
@@ -3441,7 +3472,7 @@
         </w:tc>
         <w:tc>
           <w:tcPr>
-            <w:tcW w:w="990" w:type="dxa"/>
+            <w:tcW w:w="1170" w:type="dxa"/>
             <w:vAlign w:val="center"/>
           </w:tcPr>
           <w:p>
@@ -3474,34 +3505,34 @@
         </w:tc>
         <w:tc>
           <w:tcPr>
-            <w:tcW w:w="1465" w:type="dxa"/>
-            <w:vAlign w:val="center"/>
-          </w:tcPr>
-          <w:p>
-            <w:pPr>
-              <w:pBdr>
-                <w:top w:val="none" w:sz="0" w:space="0" w:color="000000"/>
-                <w:left w:val="none" w:sz="0" w:space="0" w:color="000000"/>
-                <w:bottom w:val="none" w:sz="0" w:space="0" w:color="000000"/>
-                <w:right w:val="none" w:sz="0" w:space="0" w:color="000000"/>
-              </w:pBdr>
-              <w:spacing w:before="100" w:after="100"/>
-              <w:ind w:left="100" w:right="100"/>
-              <w:rPr>
-                <w:rFonts w:ascii="Aptos" w:eastAsia="Helvetica" w:hAnsi="Aptos" w:cs="Helvetica"/>
-                <w:color w:val="000000"/>
-                <w:sz w:val="16"/>
-                <w:szCs w:val="16"/>
-              </w:rPr>
-            </w:pPr>
-            <w:r>
-              <w:rPr>
-                <w:rFonts w:ascii="Aptos" w:eastAsia="Arial" w:hAnsi="Aptos" w:cs="Arial"/>
-                <w:color w:val="000000"/>
-                <w:sz w:val="16"/>
-                <w:szCs w:val="16"/>
-              </w:rPr>
-              <w:t>1567.20 (55.9%)</w:t>
+            <w:tcW w:w="1350" w:type="dxa"/>
+            <w:vAlign w:val="center"/>
+          </w:tcPr>
+          <w:p>
+            <w:pPr>
+              <w:pBdr>
+                <w:top w:val="none" w:sz="0" w:space="0" w:color="000000"/>
+                <w:left w:val="none" w:sz="0" w:space="0" w:color="000000"/>
+                <w:bottom w:val="none" w:sz="0" w:space="0" w:color="000000"/>
+                <w:right w:val="none" w:sz="0" w:space="0" w:color="000000"/>
+              </w:pBdr>
+              <w:spacing w:before="100" w:after="100"/>
+              <w:ind w:left="100" w:right="100"/>
+              <w:rPr>
+                <w:rFonts w:ascii="Aptos" w:eastAsia="Helvetica" w:hAnsi="Aptos" w:cs="Helvetica"/>
+                <w:color w:val="000000"/>
+                <w:sz w:val="16"/>
+                <w:szCs w:val="16"/>
+              </w:rPr>
+            </w:pPr>
+            <w:r>
+              <w:rPr>
+                <w:rFonts w:ascii="Aptos" w:eastAsia="Arial" w:hAnsi="Aptos" w:cs="Arial"/>
+                <w:color w:val="000000"/>
+                <w:sz w:val="16"/>
+                <w:szCs w:val="16"/>
+              </w:rPr>
+              <w:t>1567 (55.9%)</w:t>
             </w:r>
           </w:p>
         </w:tc>
@@ -3702,7 +3733,7 @@
         </w:tc>
         <w:tc>
           <w:tcPr>
-            <w:tcW w:w="990" w:type="dxa"/>
+            <w:tcW w:w="1170" w:type="dxa"/>
             <w:vAlign w:val="center"/>
           </w:tcPr>
           <w:p>
@@ -3735,34 +3766,52 @@
         </w:tc>
         <w:tc>
           <w:tcPr>
-            <w:tcW w:w="1465" w:type="dxa"/>
-            <w:vAlign w:val="center"/>
-          </w:tcPr>
-          <w:p>
-            <w:pPr>
-              <w:pBdr>
-                <w:top w:val="none" w:sz="0" w:space="0" w:color="000000"/>
-                <w:left w:val="none" w:sz="0" w:space="0" w:color="000000"/>
-                <w:bottom w:val="none" w:sz="0" w:space="0" w:color="000000"/>
-                <w:right w:val="none" w:sz="0" w:space="0" w:color="000000"/>
-              </w:pBdr>
-              <w:spacing w:before="100" w:after="100"/>
-              <w:ind w:left="100" w:right="100"/>
-              <w:rPr>
-                <w:rFonts w:ascii="Aptos" w:eastAsia="Helvetica" w:hAnsi="Aptos" w:cs="Helvetica"/>
-                <w:color w:val="000000"/>
-                <w:sz w:val="16"/>
-                <w:szCs w:val="16"/>
-              </w:rPr>
-            </w:pPr>
-            <w:r>
-              <w:rPr>
-                <w:rFonts w:ascii="Aptos" w:eastAsia="Arial" w:hAnsi="Aptos" w:cs="Arial"/>
-                <w:color w:val="000000"/>
-                <w:sz w:val="16"/>
-                <w:szCs w:val="16"/>
-              </w:rPr>
-              <w:t>2000.60 (20.6%)</w:t>
+            <w:tcW w:w="1350" w:type="dxa"/>
+            <w:vAlign w:val="center"/>
+          </w:tcPr>
+          <w:p>
+            <w:pPr>
+              <w:pBdr>
+                <w:top w:val="none" w:sz="0" w:space="0" w:color="000000"/>
+                <w:left w:val="none" w:sz="0" w:space="0" w:color="000000"/>
+                <w:bottom w:val="none" w:sz="0" w:space="0" w:color="000000"/>
+                <w:right w:val="none" w:sz="0" w:space="0" w:color="000000"/>
+              </w:pBdr>
+              <w:spacing w:before="100" w:after="100"/>
+              <w:ind w:left="100" w:right="100"/>
+              <w:rPr>
+                <w:rFonts w:ascii="Aptos" w:eastAsia="Helvetica" w:hAnsi="Aptos" w:cs="Helvetica"/>
+                <w:color w:val="000000"/>
+                <w:sz w:val="16"/>
+                <w:szCs w:val="16"/>
+              </w:rPr>
+            </w:pPr>
+            <w:r>
+              <w:rPr>
+                <w:rFonts w:ascii="Aptos" w:eastAsia="Arial" w:hAnsi="Aptos" w:cs="Arial"/>
+                <w:color w:val="000000"/>
+                <w:sz w:val="16"/>
+                <w:szCs w:val="16"/>
+              </w:rPr>
+              <w:t>200</w:t>
+            </w:r>
+            <w:r>
+              <w:rPr>
+                <w:rFonts w:ascii="Aptos" w:eastAsia="Arial" w:hAnsi="Aptos" w:cs="Arial"/>
+                <w:color w:val="000000"/>
+                <w:sz w:val="16"/>
+                <w:szCs w:val="16"/>
+              </w:rPr>
+              <w:t>1</w:t>
+            </w:r>
+            <w:r>
+              <w:rPr>
+                <w:rFonts w:ascii="Aptos" w:eastAsia="Arial" w:hAnsi="Aptos" w:cs="Arial"/>
+                <w:color w:val="000000"/>
+                <w:sz w:val="16"/>
+                <w:szCs w:val="16"/>
+              </w:rPr>
+              <w:t xml:space="preserve"> (20.6%)</w:t>
             </w:r>
           </w:p>
         </w:tc>
@@ -3962,7 +4011,7 @@
         </w:tc>
         <w:tc>
           <w:tcPr>
-            <w:tcW w:w="990" w:type="dxa"/>
+            <w:tcW w:w="1170" w:type="dxa"/>
             <w:vAlign w:val="center"/>
           </w:tcPr>
           <w:p>
@@ -3995,34 +4044,52 @@
         </w:tc>
         <w:tc>
           <w:tcPr>
-            <w:tcW w:w="1465" w:type="dxa"/>
-            <w:vAlign w:val="center"/>
-          </w:tcPr>
-          <w:p>
-            <w:pPr>
-              <w:pBdr>
-                <w:top w:val="none" w:sz="0" w:space="0" w:color="000000"/>
-                <w:left w:val="none" w:sz="0" w:space="0" w:color="000000"/>
-                <w:bottom w:val="none" w:sz="0" w:space="0" w:color="000000"/>
-                <w:right w:val="none" w:sz="0" w:space="0" w:color="000000"/>
-              </w:pBdr>
-              <w:spacing w:before="100" w:after="100"/>
-              <w:ind w:left="100" w:right="100"/>
-              <w:rPr>
-                <w:rFonts w:ascii="Aptos" w:eastAsia="Helvetica" w:hAnsi="Aptos" w:cs="Helvetica"/>
-                <w:color w:val="000000"/>
-                <w:sz w:val="16"/>
-                <w:szCs w:val="16"/>
-              </w:rPr>
-            </w:pPr>
-            <w:r>
-              <w:rPr>
-                <w:rFonts w:ascii="Aptos" w:eastAsia="Arial" w:hAnsi="Aptos" w:cs="Arial"/>
-                <w:color w:val="000000"/>
-                <w:sz w:val="16"/>
-                <w:szCs w:val="16"/>
-              </w:rPr>
-              <w:t>3950.20 (16.9%)</w:t>
+            <w:tcW w:w="1350" w:type="dxa"/>
+            <w:vAlign w:val="center"/>
+          </w:tcPr>
+          <w:p>
+            <w:pPr>
+              <w:pBdr>
+                <w:top w:val="none" w:sz="0" w:space="0" w:color="000000"/>
+                <w:left w:val="none" w:sz="0" w:space="0" w:color="000000"/>
+                <w:bottom w:val="none" w:sz="0" w:space="0" w:color="000000"/>
+                <w:right w:val="none" w:sz="0" w:space="0" w:color="000000"/>
+              </w:pBdr>
+              <w:spacing w:before="100" w:after="100"/>
+              <w:ind w:left="100" w:right="100"/>
+              <w:rPr>
+                <w:rFonts w:ascii="Aptos" w:eastAsia="Helvetica" w:hAnsi="Aptos" w:cs="Helvetica"/>
+                <w:color w:val="000000"/>
+                <w:sz w:val="16"/>
+                <w:szCs w:val="16"/>
+              </w:rPr>
+            </w:pPr>
+            <w:r>
+              <w:rPr>
+                <w:rFonts w:ascii="Aptos" w:eastAsia="Arial" w:hAnsi="Aptos" w:cs="Arial"/>
+                <w:color w:val="000000"/>
+                <w:sz w:val="16"/>
+                <w:szCs w:val="16"/>
+              </w:rPr>
+              <w:t>3950</w:t>
+            </w:r>
+            <w:r>
+              <w:rPr>
+                <w:rFonts w:ascii="Aptos" w:eastAsia="Arial" w:hAnsi="Aptos" w:cs="Arial"/>
+                <w:color w:val="000000"/>
+                <w:sz w:val="16"/>
+                <w:szCs w:val="16"/>
+              </w:rPr>
+              <w:t xml:space="preserve"> </w:t>
+            </w:r>
+            <w:r>
+              <w:rPr>
+                <w:rFonts w:ascii="Aptos" w:eastAsia="Arial" w:hAnsi="Aptos" w:cs="Arial"/>
+                <w:color w:val="000000"/>
+                <w:sz w:val="16"/>
+                <w:szCs w:val="16"/>
+              </w:rPr>
+              <w:t>(16.9%)</w:t>
             </w:r>
           </w:p>
         </w:tc>
@@ -4223,7 +4290,7 @@
         </w:tc>
         <w:tc>
           <w:tcPr>
-            <w:tcW w:w="990" w:type="dxa"/>
+            <w:tcW w:w="1170" w:type="dxa"/>
             <w:vAlign w:val="center"/>
           </w:tcPr>
           <w:p>
@@ -4256,34 +4323,52 @@
         </w:tc>
         <w:tc>
           <w:tcPr>
-            <w:tcW w:w="1465" w:type="dxa"/>
-            <w:vAlign w:val="center"/>
-          </w:tcPr>
-          <w:p>
-            <w:pPr>
-              <w:pBdr>
-                <w:top w:val="none" w:sz="0" w:space="0" w:color="000000"/>
-                <w:left w:val="none" w:sz="0" w:space="0" w:color="000000"/>
-                <w:bottom w:val="none" w:sz="0" w:space="0" w:color="000000"/>
-                <w:right w:val="none" w:sz="0" w:space="0" w:color="000000"/>
-              </w:pBdr>
-              <w:spacing w:before="100" w:after="100"/>
-              <w:ind w:left="100" w:right="100"/>
-              <w:rPr>
-                <w:rFonts w:ascii="Aptos" w:eastAsia="Helvetica" w:hAnsi="Aptos" w:cs="Helvetica"/>
-                <w:color w:val="000000"/>
-                <w:sz w:val="16"/>
-                <w:szCs w:val="16"/>
-              </w:rPr>
-            </w:pPr>
-            <w:r>
-              <w:rPr>
-                <w:rFonts w:ascii="Aptos" w:eastAsia="Arial" w:hAnsi="Aptos" w:cs="Arial"/>
-                <w:color w:val="000000"/>
-                <w:sz w:val="16"/>
-                <w:szCs w:val="16"/>
-              </w:rPr>
-              <w:t>4168.80 (9.6%)</w:t>
+            <w:tcW w:w="1350" w:type="dxa"/>
+            <w:vAlign w:val="center"/>
+          </w:tcPr>
+          <w:p>
+            <w:pPr>
+              <w:pBdr>
+                <w:top w:val="none" w:sz="0" w:space="0" w:color="000000"/>
+                <w:left w:val="none" w:sz="0" w:space="0" w:color="000000"/>
+                <w:bottom w:val="none" w:sz="0" w:space="0" w:color="000000"/>
+                <w:right w:val="none" w:sz="0" w:space="0" w:color="000000"/>
+              </w:pBdr>
+              <w:spacing w:before="100" w:after="100"/>
+              <w:ind w:left="100" w:right="100"/>
+              <w:rPr>
+                <w:rFonts w:ascii="Aptos" w:eastAsia="Helvetica" w:hAnsi="Aptos" w:cs="Helvetica"/>
+                <w:color w:val="000000"/>
+                <w:sz w:val="16"/>
+                <w:szCs w:val="16"/>
+              </w:rPr>
+            </w:pPr>
+            <w:r>
+              <w:rPr>
+                <w:rFonts w:ascii="Aptos" w:eastAsia="Arial" w:hAnsi="Aptos" w:cs="Arial"/>
+                <w:color w:val="000000"/>
+                <w:sz w:val="16"/>
+                <w:szCs w:val="16"/>
+              </w:rPr>
+              <w:t>416</w:t>
+            </w:r>
+            <w:r>
+              <w:rPr>
+                <w:rFonts w:ascii="Aptos" w:eastAsia="Arial" w:hAnsi="Aptos" w:cs="Arial"/>
+                <w:color w:val="000000"/>
+                <w:sz w:val="16"/>
+                <w:szCs w:val="16"/>
+              </w:rPr>
+              <w:t>9 (</w:t>
+            </w:r>
+            <w:r>
+              <w:rPr>
+                <w:rFonts w:ascii="Aptos" w:eastAsia="Arial" w:hAnsi="Aptos" w:cs="Arial"/>
+                <w:color w:val="000000"/>
+                <w:sz w:val="16"/>
+                <w:szCs w:val="16"/>
+              </w:rPr>
+              <w:t>9.6%)</w:t>
             </w:r>
           </w:p>
         </w:tc>
@@ -4483,7 +4568,7 @@
         </w:tc>
         <w:tc>
           <w:tcPr>
-            <w:tcW w:w="990" w:type="dxa"/>
+            <w:tcW w:w="1170" w:type="dxa"/>
             <w:vAlign w:val="center"/>
           </w:tcPr>
           <w:p>
@@ -4516,34 +4601,34 @@
         </w:tc>
         <w:tc>
           <w:tcPr>
-            <w:tcW w:w="1465" w:type="dxa"/>
-            <w:vAlign w:val="center"/>
-          </w:tcPr>
-          <w:p>
-            <w:pPr>
-              <w:pBdr>
-                <w:top w:val="none" w:sz="0" w:space="0" w:color="000000"/>
-                <w:left w:val="none" w:sz="0" w:space="0" w:color="000000"/>
-                <w:bottom w:val="none" w:sz="0" w:space="0" w:color="000000"/>
-                <w:right w:val="none" w:sz="0" w:space="0" w:color="000000"/>
-              </w:pBdr>
-              <w:spacing w:before="100" w:after="100"/>
-              <w:ind w:left="100" w:right="100"/>
-              <w:rPr>
-                <w:rFonts w:ascii="Aptos" w:eastAsia="Helvetica" w:hAnsi="Aptos" w:cs="Helvetica"/>
-                <w:color w:val="000000"/>
-                <w:sz w:val="16"/>
-                <w:szCs w:val="16"/>
-              </w:rPr>
-            </w:pPr>
-            <w:r>
-              <w:rPr>
-                <w:rFonts w:ascii="Aptos" w:eastAsia="Arial" w:hAnsi="Aptos" w:cs="Arial"/>
-                <w:color w:val="000000"/>
-                <w:sz w:val="16"/>
-                <w:szCs w:val="16"/>
-              </w:rPr>
-              <w:t>4892.00 (12.4%)</w:t>
+            <w:tcW w:w="1350" w:type="dxa"/>
+            <w:vAlign w:val="center"/>
+          </w:tcPr>
+          <w:p>
+            <w:pPr>
+              <w:pBdr>
+                <w:top w:val="none" w:sz="0" w:space="0" w:color="000000"/>
+                <w:left w:val="none" w:sz="0" w:space="0" w:color="000000"/>
+                <w:bottom w:val="none" w:sz="0" w:space="0" w:color="000000"/>
+                <w:right w:val="none" w:sz="0" w:space="0" w:color="000000"/>
+              </w:pBdr>
+              <w:spacing w:before="100" w:after="100"/>
+              <w:ind w:left="100" w:right="100"/>
+              <w:rPr>
+                <w:rFonts w:ascii="Aptos" w:eastAsia="Helvetica" w:hAnsi="Aptos" w:cs="Helvetica"/>
+                <w:color w:val="000000"/>
+                <w:sz w:val="16"/>
+                <w:szCs w:val="16"/>
+              </w:rPr>
+            </w:pPr>
+            <w:r>
+              <w:rPr>
+                <w:rFonts w:ascii="Aptos" w:eastAsia="Arial" w:hAnsi="Aptos" w:cs="Arial"/>
+                <w:color w:val="000000"/>
+                <w:sz w:val="16"/>
+                <w:szCs w:val="16"/>
+              </w:rPr>
+              <w:t>4892 (12.4%)</w:t>
             </w:r>
           </w:p>
         </w:tc>
@@ -5641,6 +5726,7 @@
     <w:lsdException w:name="Book Title" w:uiPriority="33" w:qFormat="1"/>
     <w:lsdException w:name="Bibliography" w:semiHidden="1" w:uiPriority="37" w:unhideWhenUsed="1"/>
     <w:lsdException w:name="TOC Heading" w:semiHidden="1" w:uiPriority="39" w:unhideWhenUsed="1" w:qFormat="1"/>
+    <w:lsdException w:name="Plain Table 1" w:uiPriority="41"/>
     <w:lsdException w:name="Grid Table 4" w:uiPriority="49"/>
     <w:lsdException w:name="Grid Table 5 Dark" w:uiPriority="50"/>
     <w:lsdException w:name="Grid Table 6 Colorful" w:uiPriority="51"/>
@@ -6163,7 +6249,7 @@
   <w:style w:type="table" w:styleId="PlainTable1">
     <w:name w:val="Plain Table 1"/>
     <w:basedOn w:val="TableNormal"/>
-    <w:uiPriority w:val="99"/>
+    <w:uiPriority w:val="41"/>
     <w:rsid w:val="00FD6582"/>
     <w:tblPr>
       <w:tblStyleRowBandSize w:val="1"/>

</xml_diff>